<commit_message>
Adiciona vídeos de síndico em campo e prova social ao calendário de setembro (Strategia)
Nas sextas-feiras do calendário editorial de setembro:
- 04/09 e 11/09 passam a ser os dois vídeos de prova social (depoimentos de
  condomínios atendidos), um em cada primeira/segunda semana do mês
- 18/09 e 25/09 passam a ser vídeos do síndico em campo, tom descontraído,
  caminhando/trabalhando e falando direto pra câmera

Quartas-feiras mantêm o formato carrossel educativo (Educa → Qualifica →
Venda) e a cadência quarta/sexta é preservada.

Co-Authored-By: Claude Sonnet 5 <noreply@anthropic.com>
Claude-Session: https://claude.ai/code/session_01Qco3rELextfq6k1B91gUBk
</commit_message>
<xml_diff>
--- a/strategia-sindicos/calendarios-editoriais/Calendario_Editorial_Strategia_Setembro2026.docx
+++ b/strategia-sindicos/calendarios-editoriais/Calendario_Editorial_Strategia_Setembro2026.docx
@@ -36,7 +36,7 @@
         <w:ind w:left="400"/>
       </w:pPr>
       <w:r>
-        <w:t>Nota: Setembro fecha o trimestre com um funil mais direto: os posts de storytelling (sextas) constroem identificação com a dor do condomínio sem gestão profissional, e o par de 23–25/09 conduz explicitamente para o convite de troca de síndico/gestão.</w:t>
+        <w:t>Nota: Setembro fecha o trimestre com um funil mais direto: as quartas mantêm os carrosséis educativos (Educa → Qualifica → Venda) e as sextas passam a ser 100% em vídeo — as duas primeiras (04/09 e 11/09) trazem os vídeos de prova social já gravados (depoimentos de condomínios atendidos), e as duas últimas (18/09 e 25/09) trazem vídeos do síndico em campo, em tom descontraído, caminhando e falando direto pra câmera, até o par de 23–25/09 conduzir explicitamente para o convite de troca de síndico/gestão.</w:t>
       </w:r>
     </w:p>
     <w:p>
@@ -291,39 +291,88 @@
       </w:r>
     </w:p>
     <w:p>
+      <w:pPr/>
       <w:r>
-        <w:t>Objetivo: Geração de demanda — identificação e humor</w:t>
+        <w:rPr>
+          <w:b w:val="0"/>
+        </w:rPr>
+        <w:t>Objetivo: Prova social — validação real da gestão Strategia (vídeo já gravado)</w:t>
       </w:r>
     </w:p>
     <w:p>
+      <w:pPr/>
       <w:r>
-        <w:t>Temática macro: A vaga de garagem que "sempre" é invadida</w:t>
+        <w:rPr>
+          <w:b w:val="0"/>
+        </w:rPr>
+        <w:t>Temática macro: Depoimento de condomínio atendido pela Strategia</w:t>
       </w:r>
     </w:p>
     <w:p>
+      <w:pPr/>
       <w:r>
-        <w:t>Eixo: Dor: conflito recorrente sem solução definitiva · Desejo: regra cumprida e respeitada</w:t>
+        <w:rPr>
+          <w:b w:val="0"/>
+        </w:rPr>
+        <w:t>Eixo: Dor: insegurança de contratar uma gestão sem saber se funciona · Desejo: ver prova real de que funciona</w:t>
       </w:r>
     </w:p>
     <w:p>
+      <w:pPr/>
       <w:r>
         <w:rPr>
           <w:b/>
         </w:rPr>
-        <w:t>Conteúdo do post</w:t>
+        <w:t>Conteúdo do vídeo</w:t>
       </w:r>
     </w:p>
     <w:p>
+      <w:pPr/>
       <w:r>
-        <w:t>Headline: "Foi só uma vez." A oitava vez que foi só uma vez.</w:t>
+        <w:rPr>
+          <w:b w:val="0"/>
+        </w:rPr>
+        <w:t>Formato: Vídeo de depoimento (material já gravado) — síndico e/ou morador do condomínio cliente contando a experiência com a Strategia</w:t>
       </w:r>
     </w:p>
     <w:p>
+      <w:pPr/>
       <w:r>
-        <w:t>Visual: ilustração leve com tom de humor — garagem de condomínio. Fundo claro.</w:t>
+        <w:rPr>
+          <w:b w:val="0"/>
+        </w:rPr>
+        <w:t>Edição — Abertura: frase de maior impacto do depoimento, cortada como gancho nos primeiros segundos</w:t>
       </w:r>
     </w:p>
     <w:p>
+      <w:pPr/>
+      <w:r>
+        <w:rPr>
+          <w:b w:val="0"/>
+        </w:rPr>
+        <w:t>Edição — Corpo: depoimento na íntegra, com inserts de imagens do condomínio (fachada/áreas comuns) entre os cortes</w:t>
+      </w:r>
+    </w:p>
+    <w:p>
+      <w:pPr/>
+      <w:r>
+        <w:rPr>
+          <w:b w:val="0"/>
+        </w:rPr>
+        <w:t>Edição — Fechamento: resultado alcançado + CTA em texto na tela</w:t>
+      </w:r>
+    </w:p>
+    <w:p>
+      <w:pPr/>
+      <w:r>
+        <w:rPr>
+          <w:b w:val="0"/>
+        </w:rPr>
+        <w:t>Headline (texto na tela): "Achávamos que gestão profissional não ia mudar muita coisa. A gente tava errado."</w:t>
+      </w:r>
+    </w:p>
+    <w:p>
+      <w:pPr/>
       <w:r>
         <w:rPr>
           <w:b/>
@@ -332,56 +381,66 @@
       </w:r>
     </w:p>
     <w:p>
+      <w:pPr/>
       <w:r>
-        <w:t>Tem sempre alguém que estaciona na vaga errada "só por um minutinho". E esse minutinho já está lá há anos, em forma de hábito.</w:t>
+        <w:rPr>
+          <w:b w:val="0"/>
+        </w:rPr>
+        <w:t>Não é discurso nosso. É de quem já contratou.</w:t>
       </w:r>
     </w:p>
     <w:p>
+      <w:pPr/>
       <w:r>
-        <w:t>O síndico morador tenta resolver de boa, manda mensagem educada, recebe a mesma desculpa — e o ciclo recomeça no mês seguinte.</w:t>
+        <w:rPr>
+          <w:b w:val="0"/>
+        </w:rPr>
+        <w:t>Assista o vídeo de hoje e ouça direto de quem viveu a mudança na gestão do condomínio.</w:t>
       </w:r>
     </w:p>
     <w:p>
+      <w:pPr/>
       <w:r>
-        <w:t>Regra sem aplicação não é regra. É sugestão. E sugestão não resolve conflito de vaga de garagem.</w:t>
+        <w:rPr>
+          <w:b w:val="0"/>
+        </w:rPr>
+        <w:t>Comente: DEPOIMENTO e a gente te manda mais casos como esse no direct.</w:t>
       </w:r>
     </w:p>
     <w:p>
-      <w:r>
-        <w:t>Gestão profissional aplica a regra com consistência — sem precisar brigar, porque o protocolo já está definido antes do problema acontecer.</w:t>
-      </w:r>
-    </w:p>
-    <w:p>
-      <w:r>
-        <w:t>Comente: VAGA aqui e a gente te mostra como aplicamos isso na prática, direto no seu direct.</w:t>
-      </w:r>
-    </w:p>
-    <w:p>
+      <w:pPr/>
       <w:r>
         <w:rPr>
           <w:b/>
         </w:rPr>
-        <w:t>Stories (sequência de 4)</w:t>
+        <w:t>Stories (sequência de 3)</w:t>
       </w:r>
     </w:p>
     <w:p>
+      <w:pPr/>
       <w:r>
-        <w:t>S1: Tem alguém assim no seu condomínio? (enquete: Tem, e é demais / Já teve, mas resolvemos / Aqui não tem)</w:t>
+        <w:rPr>
+          <w:b w:val="0"/>
+        </w:rPr>
+        <w:t>S1: Antes de qualquer prova, tem uma pergunta simples: gestão profissional muda mesmo alguma coisa? (enquete: Acho que sim / Tenho dúvida)</w:t>
       </w:r>
     </w:p>
     <w:p>
+      <w:pPr/>
       <w:r>
-        <w:t>S2: "Foi só uma vez" dito pela oitava vez já não é desculpa, é padrão.</w:t>
+        <w:rPr>
+          <w:b w:val="0"/>
+        </w:rPr>
+        <w:t>S2: O vídeo de hoje é a resposta — direto de quem já contratou.</w:t>
       </w:r>
     </w:p>
     <w:p>
+      <w:pPr/>
       <w:r>
-        <w:t>S3: Regra sem aplicação consistente vira sugestão — e sugestão ninguém segue.</w:t>
-      </w:r>
-    </w:p>
-    <w:p>
-      <w:r>
-        <w:t>S4: Comenta VAGA no post de hoje e vê como resolvemos isso sem brigar com ninguém. 👆</w:t>
+        <w:rPr>
+          <w:b w:val="0"/>
+        </w:rPr>
+        <w:t>S3: Assista o vídeo completo no feed e comenta DEPOIMENTO. 👆</w:t>
       </w:r>
     </w:p>
     <w:p>
@@ -636,39 +695,88 @@
       </w:r>
     </w:p>
     <w:p>
+      <w:pPr/>
       <w:r>
-        <w:t>Objetivo: Geração de demanda — síndico morador sobrecarregado emocionalmente</w:t>
+        <w:rPr>
+          <w:b w:val="0"/>
+        </w:rPr>
+        <w:t>Objetivo: Prova social — reforço de credibilidade e conversão (vídeo já gravado)</w:t>
       </w:r>
     </w:p>
     <w:p>
+      <w:pPr/>
       <w:r>
-        <w:t>Temática macro: O síndico que virou vilão por cobrar</w:t>
+        <w:rPr>
+          <w:b w:val="0"/>
+        </w:rPr>
+        <w:t>Temática macro: Segundo depoimento de condomínio atendido pela Strategia</w:t>
       </w:r>
     </w:p>
     <w:p>
+      <w:pPr/>
       <w:r>
-        <w:t>Eixo: Dor: desgaste emocional de cobrar o vizinho · Desejo: cobrança sem desgastar relação pessoal</w:t>
+        <w:rPr>
+          <w:b w:val="0"/>
+        </w:rPr>
+        <w:t>Eixo: Dor: medo de repetir uma decisão de gestão que não deu certo antes · Desejo: confiança baseada em resultado comprovado</w:t>
       </w:r>
     </w:p>
     <w:p>
+      <w:pPr/>
       <w:r>
         <w:rPr>
           <w:b/>
         </w:rPr>
-        <w:t>Conteúdo do post</w:t>
+        <w:t>Conteúdo do vídeo</w:t>
       </w:r>
     </w:p>
     <w:p>
+      <w:pPr/>
       <w:r>
-        <w:t>Headline: Ele só pediu pra pagar o que devia. E virou o vilão do prédio inteiro.</w:t>
+        <w:rPr>
+          <w:b w:val="0"/>
+        </w:rPr>
+        <w:t>Formato: Vídeo de depoimento (material já gravado) — segundo case, condomínio/síndico diferente do vídeo de 04/09</w:t>
       </w:r>
     </w:p>
     <w:p>
+      <w:pPr/>
       <w:r>
-        <w:t>Visual: foto de pessoa pensativa em corredor de condomínio. Tom sério, fundo neutro.</w:t>
+        <w:rPr>
+          <w:b w:val="0"/>
+        </w:rPr>
+        <w:t>Edição — Abertura: contexto do "antes" (o problema que o condomínio tinha antes da Strategia)</w:t>
       </w:r>
     </w:p>
     <w:p>
+      <w:pPr/>
+      <w:r>
+        <w:rPr>
+          <w:b w:val="0"/>
+        </w:rPr>
+        <w:t>Edição — Corpo: depoimento na íntegra</w:t>
+      </w:r>
+    </w:p>
+    <w:p>
+      <w:pPr/>
+      <w:r>
+        <w:rPr>
+          <w:b w:val="0"/>
+        </w:rPr>
+        <w:t>Edição — Fechamento: o "depois" + CTA em texto na tela</w:t>
+      </w:r>
+    </w:p>
+    <w:p>
+      <w:pPr/>
+      <w:r>
+        <w:rPr>
+          <w:b w:val="0"/>
+        </w:rPr>
+        <w:t>Headline (texto na tela): "Trocamos de gestão com medo. Hoje, a única dúvida é por que não trocamos antes."</w:t>
+      </w:r>
+    </w:p>
+    <w:p>
+      <w:pPr/>
       <w:r>
         <w:rPr>
           <w:b/>
@@ -677,51 +785,66 @@
       </w:r>
     </w:p>
     <w:p>
+      <w:pPr/>
       <w:r>
-        <w:t>O síndico morador cobrou a taxa em atraso do vizinho do 302. Fez certo. Seguiu o regimento. E, ainda assim, passou a ser tratado como o problema — não a inadimplência.</w:t>
+        <w:rPr>
+          <w:b w:val="0"/>
+        </w:rPr>
+        <w:t>Mais um condomínio, mais uma prova de que gestão profissional muda o dia a dia de verdade.</w:t>
       </w:r>
     </w:p>
     <w:p>
+      <w:pPr/>
       <w:r>
-        <w:t>É o peso que ninguém avisa quando alguém topa ser síndico do próprio prédio: cobrar quem você cruza no elevador todos os dias.</w:t>
+        <w:rPr>
+          <w:b w:val="0"/>
+        </w:rPr>
+        <w:t>Assista o depoimento completo no vídeo de hoje.</w:t>
       </w:r>
     </w:p>
     <w:p>
+      <w:pPr/>
       <w:r>
-        <w:t>Gestão profissional existe pra tirar esse fardo do morador. Cobrança vira processo, não relação pessoal — e o síndico volta a ser só vizinho.</w:t>
+        <w:rPr>
+          <w:b w:val="0"/>
+        </w:rPr>
+        <w:t>Comente: RESULTADO e fala com a gente no direct.</w:t>
       </w:r>
     </w:p>
     <w:p>
-      <w:r>
-        <w:t>Comente: COBRANÇA aqui e a gente te explica como isso funciona sem desgaste, direto no seu direct.</w:t>
-      </w:r>
-    </w:p>
-    <w:p>
+      <w:pPr/>
       <w:r>
         <w:rPr>
           <w:b/>
         </w:rPr>
-        <w:t>Stories (sequência de 4)</w:t>
+        <w:t>Stories (sequência de 3)</w:t>
       </w:r>
     </w:p>
     <w:p>
+      <w:pPr/>
       <w:r>
-        <w:t>S1: Você já evitou cobrar alguém no condomínio pra não desgastar a relação? (enquete: Já, mais de uma vez / Nunca precisei / Não sou síndico)</w:t>
+        <w:rPr>
+          <w:b w:val="0"/>
+        </w:rPr>
+        <w:t>S1: Segundo depoimento da semana — outro condomínio, o mesmo resultado.</w:t>
       </w:r>
     </w:p>
     <w:p>
+      <w:pPr/>
       <w:r>
-        <w:t>S2: Cobrar o vizinho do lado é o tipo de tarefa que ninguém avisa que vem junto com o cargo.</w:t>
+        <w:rPr>
+          <w:b w:val="0"/>
+        </w:rPr>
+        <w:t>S2: Quem já trocou de gestão com a Strategia conta como foi.</w:t>
       </w:r>
     </w:p>
     <w:p>
+      <w:pPr/>
       <w:r>
-        <w:t>S3: Cobrança feita por terceiro profissional tira o peso pessoal de cima do síndico morador.</w:t>
-      </w:r>
-    </w:p>
-    <w:p>
-      <w:r>
-        <w:t>S4: Comenta COBRANÇA no post de hoje e fala com a gente. 👆</w:t>
+        <w:rPr>
+          <w:b w:val="0"/>
+        </w:rPr>
+        <w:t>S3: Assiste o vídeo completo e comenta RESULTADO. 👆</w:t>
       </w:r>
     </w:p>
     <w:p>
@@ -976,39 +1099,79 @@
       </w:r>
     </w:p>
     <w:p>
+      <w:pPr/>
       <w:r>
-        <w:t>Objetivo: Geração de demanda — condomínio sem síndico profissional</w:t>
+        <w:rPr>
+          <w:b w:val="0"/>
+        </w:rPr>
+        <w:t>Objetivo: Geração de demanda — condomínio sem síndico profissional (vídeo descontraído)</w:t>
       </w:r>
     </w:p>
     <w:p>
+      <w:pPr/>
       <w:r>
+        <w:rPr>
+          <w:b w:val="0"/>
+        </w:rPr>
         <w:t>Temática macro: O grupo de WhatsApp que substituiu a assembleia</w:t>
       </w:r>
     </w:p>
     <w:p>
+      <w:pPr/>
       <w:r>
+        <w:rPr>
+          <w:b w:val="0"/>
+        </w:rPr>
         <w:t>Eixo: Dor: decisões importantes sendo tomadas informalmente no grupo · Desejo: decisão formal, documentada e válida</w:t>
       </w:r>
     </w:p>
     <w:p>
+      <w:pPr/>
       <w:r>
         <w:rPr>
           <w:b/>
         </w:rPr>
-        <w:t>Conteúdo do post</w:t>
+        <w:t>Conteúdo do vídeo</w:t>
       </w:r>
     </w:p>
     <w:p>
+      <w:pPr/>
       <w:r>
-        <w:t>Headline: "Decidimos no grupo" não é decisão de condomínio. É só decisão de quem estava online naquela hora.</w:t>
+        <w:rPr>
+          <w:b w:val="0"/>
+        </w:rPr>
+        <w:t>Formato: Vídeo vertical (Reels) — síndico em campo, caminhando pelas áreas comuns, falando direto pra câmera em tom leve/bem-humorado</w:t>
       </w:r>
     </w:p>
     <w:p>
+      <w:pPr/>
       <w:r>
-        <w:t>Visual: tela de celular estilizada, conversa de grupo. Tom direto, fundo neutro.</w:t>
+        <w:rPr>
+          <w:b w:val="0"/>
+        </w:rPr>
+        <w:t>Roteiro — Gancho (0-3s): síndico com celular na mão: "Reforma aprovada... numa figurinha de like. Sério?"</w:t>
       </w:r>
     </w:p>
     <w:p>
+      <w:pPr/>
+      <w:r>
+        <w:rPr>
+          <w:b w:val="0"/>
+        </w:rPr>
+        <w:t>Roteiro — Corpo: síndico caminha pelo condomínio narrando com humor os "grandes momentos" decididos no grupo (reforma por "like", taxa extra combinada às 2h da manhã)</w:t>
+      </w:r>
+    </w:p>
+    <w:p>
+      <w:pPr/>
+      <w:r>
+        <w:rPr>
+          <w:b w:val="0"/>
+        </w:rPr>
+        <w:t>Roteiro — Fechamento: síndico para, tom mais sério: "Grupo é ótimo pra aviso. Decisão de condomínio precisa de assembleia, convocação e ata. Sempre."</w:t>
+      </w:r>
+    </w:p>
+    <w:p>
+      <w:pPr/>
       <w:r>
         <w:rPr>
           <w:b/>
@@ -1017,51 +1180,66 @@
       </w:r>
     </w:p>
     <w:p>
+      <w:pPr/>
       <w:r>
-        <w:t>Mudança de fornecedor decidida em três mensagens. Reforma aprovada por "like" numa figurinha. Taxa extra combinada num áudio de madrugada.</w:t>
+        <w:rPr>
+          <w:b w:val="0"/>
+        </w:rPr>
+        <w:t>"Decidimos no grupo" não é decisão de condomínio. É só decisão de quem estava online naquela hora.</w:t>
       </w:r>
     </w:p>
     <w:p>
+      <w:pPr/>
       <w:r>
-        <w:t>Parece prático. Mas não tem validade jurídica nenhuma — e quando alguém questiona depois, não existe ata, não existe quórum, não existe nada que sustente a decisão.</w:t>
+        <w:rPr>
+          <w:b w:val="0"/>
+        </w:rPr>
+        <w:t>No vídeo de hoje, mostramos por que isso não tem validade nenhuma — e o que fazer no lugar.</w:t>
       </w:r>
     </w:p>
     <w:p>
+      <w:pPr/>
       <w:r>
-        <w:t>O grupo é ótimo pra avisos rápidos. Decisão de condomínio precisa de assembleia, convocação e ata — sempre.</w:t>
-      </w:r>
-    </w:p>
-    <w:p>
-      <w:r>
+        <w:rPr>
+          <w:b w:val="0"/>
+        </w:rPr>
         <w:t>Comente: DECISÃO aqui e a gente te explica como formalizar isso direito, direto no seu direct.</w:t>
       </w:r>
     </w:p>
     <w:p>
+      <w:pPr/>
       <w:r>
         <w:rPr>
           <w:b/>
         </w:rPr>
-        <w:t>Stories (sequência de 4)</w:t>
+        <w:t>Stories (sequência de 3)</w:t>
       </w:r>
     </w:p>
     <w:p>
+      <w:pPr/>
       <w:r>
+        <w:rPr>
+          <w:b w:val="0"/>
+        </w:rPr>
         <w:t>S1: Alguma decisão importante do seu condomínio já foi tomada só pelo grupo de WhatsApp? (enquete: Já, mais de uma vez / Nunca / Não sei dizer)</w:t>
       </w:r>
     </w:p>
     <w:p>
+      <w:pPr/>
       <w:r>
-        <w:t>S2: "Decidimos no grupo" não tem validade jurídica nenhuma.</w:t>
+        <w:rPr>
+          <w:b w:val="0"/>
+        </w:rPr>
+        <w:t>S2: No vídeo de hoje, o síndico mostra os "clássicos" decididos no grupo — e por que isso pode dar problema.</w:t>
       </w:r>
     </w:p>
     <w:p>
+      <w:pPr/>
       <w:r>
-        <w:t>S3: Decisão de condomínio sempre precisa de assembleia, convocação e ata.</w:t>
-      </w:r>
-    </w:p>
-    <w:p>
-      <w:r>
-        <w:t>S4: Comenta DECISÃO no post de hoje e a gente te mostra como formalizar certo. 👆</w:t>
+        <w:rPr>
+          <w:b w:val="0"/>
+        </w:rPr>
+        <w:t>S3: Comenta DECISÃO no vídeo de hoje e a gente te mostra como formalizar certo. 👆</w:t>
       </w:r>
     </w:p>
     <w:p>
@@ -1331,39 +1509,79 @@
       </w:r>
     </w:p>
     <w:p>
+      <w:pPr/>
       <w:r>
-        <w:t>Objetivo: Conversão direta — condomínio insatisfeito decidido a mudar</w:t>
+        <w:rPr>
+          <w:b w:val="0"/>
+        </w:rPr>
+        <w:t>Objetivo: Conversão direta — condomínio insatisfeito decidido a mudar (vídeo)</w:t>
       </w:r>
     </w:p>
     <w:p>
+      <w:pPr/>
       <w:r>
+        <w:rPr>
+          <w:b w:val="0"/>
+        </w:rPr>
         <w:t>Temática macro: O morador que sabia que precisava mudar, mas não sabia como começar</w:t>
       </w:r>
     </w:p>
     <w:p>
+      <w:pPr/>
       <w:r>
+        <w:rPr>
+          <w:b w:val="0"/>
+        </w:rPr>
         <w:t>Eixo: Dor: insatisfação acumulada sem ação · Desejo: dar o primeiro passo com segurança</w:t>
       </w:r>
     </w:p>
     <w:p>
+      <w:pPr/>
       <w:r>
         <w:rPr>
           <w:b/>
         </w:rPr>
-        <w:t>Conteúdo do post</w:t>
+        <w:t>Conteúdo do vídeo</w:t>
       </w:r>
     </w:p>
     <w:p>
+      <w:pPr/>
       <w:r>
-        <w:t>Headline: Você sabia que a gestão do seu condomínio não estava funcionando. Só não sabia por onde começar a mudar isso.</w:t>
+        <w:rPr>
+          <w:b w:val="0"/>
+        </w:rPr>
+        <w:t>Formato: Vídeo vertical (Reels) — síndico falando direto e parado pra câmera, tom próximo e acolhedor (fechamento do mês)</w:t>
       </w:r>
     </w:p>
     <w:p>
+      <w:pPr/>
       <w:r>
-        <w:t>Visual: foto de fachada de condomínio, luz do fim de tarde, tom de virada. Fundo neutro/acolhedor.</w:t>
+        <w:rPr>
+          <w:b w:val="0"/>
+        </w:rPr>
+        <w:t>Roteiro — Gancho (0-3s): síndico, plano fechado: "Se você já sabe que a gestão do seu condomínio não tá funcionando, esse vídeo é pra você."</w:t>
       </w:r>
     </w:p>
     <w:p>
+      <w:pPr/>
+      <w:r>
+        <w:rPr>
+          <w:b w:val="0"/>
+        </w:rPr>
+        <w:t>Roteiro — Corpo: síndico fala em tom direto e pessoal sobre os sinais comuns (contrato vencido, contas pouco claras, manutenção atrasada, decisões no grupo de WhatsApp)</w:t>
+      </w:r>
+    </w:p>
+    <w:p>
+      <w:pPr/>
+      <w:r>
+        <w:rPr>
+          <w:b w:val="0"/>
+        </w:rPr>
+        <w:t>Roteiro — Fechamento: convite ao diagnóstico gratuito, CTA em texto na tela</w:t>
+      </w:r>
+    </w:p>
+    <w:p>
+      <w:pPr/>
       <w:r>
         <w:rPr>
           <w:b/>
@@ -1372,51 +1590,75 @@
       </w:r>
     </w:p>
     <w:p>
+      <w:pPr/>
       <w:r>
+        <w:rPr>
+          <w:b w:val="0"/>
+        </w:rPr>
         <w:t>Você já notou: contrato vencido, contas pouco claras, manutenção sempre atrasada, grupo de WhatsApp decidindo o que devia ser assembleia.</w:t>
       </w:r>
     </w:p>
     <w:p>
+      <w:pPr/>
       <w:r>
+        <w:rPr>
+          <w:b w:val="0"/>
+        </w:rPr>
         <w:t>Cada item, sozinho, parece pequeno. Juntos, eles formam o motivo de tanta gente continuar insatisfeita — sem agir, porque parece trabalhoso demais resolver.</w:t>
       </w:r>
     </w:p>
     <w:p>
+      <w:pPr/>
       <w:r>
+        <w:rPr>
+          <w:b w:val="0"/>
+        </w:rPr>
         <w:t>Não precisa ser. O primeiro passo é simples: um diagnóstico gratuito mostra exatamente onde está o problema e o que muda com gestão profissional.</w:t>
       </w:r>
     </w:p>
     <w:p>
+      <w:pPr/>
       <w:r>
+        <w:rPr>
+          <w:b w:val="0"/>
+        </w:rPr>
         <w:t>Comente: MUDAR aqui e a nossa equipe te chama no direct pra começar.</w:t>
       </w:r>
     </w:p>
     <w:p>
+      <w:pPr/>
       <w:r>
         <w:rPr>
           <w:b/>
         </w:rPr>
-        <w:t>Stories (sequência de 4)</w:t>
+        <w:t>Stories (sequência de 3)</w:t>
       </w:r>
     </w:p>
     <w:p>
+      <w:pPr/>
       <w:r>
+        <w:rPr>
+          <w:b w:val="0"/>
+        </w:rPr>
         <w:t>S1: O que mais te incomoda na gestão atual do seu condomínio? (caixa de pergunta)</w:t>
       </w:r>
     </w:p>
     <w:p>
+      <w:pPr/>
       <w:r>
-        <w:t>S2: Cada problema pequeno, sozinho, parece tolerável. Juntos, eles cansam.</w:t>
+        <w:rPr>
+          <w:b w:val="0"/>
+        </w:rPr>
+        <w:t>S2: No vídeo de hoje, direto do síndico: cada problema pequeno, sozinho, parece tolerável. Juntos, eles cansam.</w:t>
       </w:r>
     </w:p>
     <w:p>
+      <w:pPr/>
       <w:r>
-        <w:t>S3: O primeiro passo pra mudar é só um diagnóstico — e ele é gratuito.</w:t>
-      </w:r>
-    </w:p>
-    <w:p>
-      <w:r>
-        <w:t>S4: Comenta MUDAR no post de hoje. A gente começa a conversa com você. 👆</w:t>
+        <w:rPr>
+          <w:b w:val="0"/>
+        </w:rPr>
+        <w:t>S3: Comenta MUDAR no vídeo de hoje. A gente começa a conversa com você. 👆</w:t>
       </w:r>
     </w:p>
     <w:sectPr>

</xml_diff>

<commit_message>
Fecha o conteúdo de 25/09 no calendário de setembro (Strategia)
Com base no vídeo de referência enviado (humor curto: pessoa cansada na
mesa + porta-retrato com "foto" irônica), adapta o formato pro universo
do síndico: motivação irônica ligada à rotina de condomínio (ex.: "taxa
em dia", "grupo sem drama"), fechando o slot que estava pendente.

Co-Authored-By: Claude Sonnet 5 <noreply@anthropic.com>
Claude-Session: https://claude.ai/code/session_01Qco3rELextfq6k1B91gUBk
</commit_message>
<xml_diff>
--- a/strategia-sindicos/calendarios-editoriais/Calendario_Editorial_Strategia_Setembro2026.docx
+++ b/strategia-sindicos/calendarios-editoriais/Calendario_Editorial_Strategia_Setembro2026.docx
@@ -1401,9 +1401,9 @@
       <w:pPr/>
       <w:r>
         <w:rPr>
-          <w:b/>
+          <w:b w:val="0"/>
         </w:rPr>
-        <w:t>⚠ Pendente de confirmação: não consegui abrir o link de referência enviado (Instagram bloqueado neste ambiente). Preciso que você descreva o formato/tema desse vídeo (ou mande print/resumo) pra eu fechar o roteiro deste dia — deixei abaixo uma sugestão provisória, que pode ser trocada.</w:t>
+        <w:t>Referência: vídeo de humor curtinho — pessoa cansada na mesa de trabalho + texto de motivação, corte pra um porta-retrato com uma "foto" irônica dentro</w:t>
       </w:r>
     </w:p>
     <w:p>
@@ -1412,7 +1412,7 @@
         <w:rPr>
           <w:b w:val="0"/>
         </w:rPr>
-        <w:t>Objetivo (provisório): Geração de demanda — vídeo leve, formato ainda a confirmar com base na referência</w:t>
+        <w:t>Objetivo: Engajamento leve / identificação bem-humorada</w:t>
       </w:r>
     </w:p>
     <w:p>
@@ -1421,7 +1421,16 @@
         <w:rPr>
           <w:b w:val="0"/>
         </w:rPr>
-        <w:t>Temática macro (provisória): "Coisas que só quem já foi síndico entende" — trend/checklist rápido</w:t>
+        <w:t>Temática macro: A motivação real de quem cuida de condomínio</w:t>
+      </w:r>
+    </w:p>
+    <w:p>
+      <w:pPr/>
+      <w:r>
+        <w:rPr>
+          <w:b w:val="0"/>
+        </w:rPr>
+        <w:t>Eixo: Gatilho de humor: o clichê de "motivação" no trabalho, só que com uma virada irônica ligada à rotina do síndico · Desejo: leveza e identificação</w:t>
       </w:r>
     </w:p>
     <w:p>
@@ -1430,7 +1439,7 @@
         <w:rPr>
           <w:b/>
         </w:rPr>
-        <w:t>Conteúdo do vídeo (provisório)</w:t>
+        <w:t>Conteúdo do vídeo</w:t>
       </w:r>
     </w:p>
     <w:p>
@@ -1439,7 +1448,7 @@
         <w:rPr>
           <w:b w:val="0"/>
         </w:rPr>
-        <w:t>Formato: a definir a partir da referência enviada</w:t>
+        <w:t>Formato: vídeo vertical curto (10-15s), com música/trend de fundo — síndico(a) sentado(a) na mesa, ar cansado, texto na tela aparece, depois corta pra um porta-retrato mostrado em cena</w:t>
       </w:r>
     </w:p>
     <w:p>
@@ -1448,7 +1457,97 @@
         <w:rPr>
           <w:b w:val="0"/>
         </w:rPr>
-        <w:t>Assim que você confirmar o conteúdo do link, eu reescrevo objetivo, roteiro, legenda e stories deste dia.</w:t>
+        <w:t>Roteiro — Cena 1: síndico(a) sentado(a) à mesa (computador/planilha ao fundo), expressão de cansaço, olhando pro lado</w:t>
+      </w:r>
+    </w:p>
+    <w:p>
+      <w:pPr/>
+      <w:r>
+        <w:rPr>
+          <w:b w:val="0"/>
+        </w:rPr>
+        <w:t>Roteiro — Cena 2: pega um porta-retrato e mostra pra câmera — dentro do porta-retrato, no lugar de uma foto, está escrito à mão algo como "TAXA EM DIA" ou "GRUPO DO WHATSAPP SEM DRAMA HOJE" (escolher a frase mais engraçada/real pro dia a dia de vocês)</w:t>
+      </w:r>
+    </w:p>
+    <w:p>
+      <w:pPr/>
+      <w:r>
+        <w:rPr>
+          <w:b w:val="0"/>
+        </w:rPr>
+        <w:t>Roteiro — Fechamento: síndico(a) sorri/balança a cabeça, sem falar nada, vídeo termina</w:t>
+      </w:r>
+    </w:p>
+    <w:p>
+      <w:pPr/>
+      <w:r>
+        <w:rPr>
+          <w:b/>
+        </w:rPr>
+        <w:t>TEXTO NA TELA (aparece por cima da Cena 1, sem áudio de fala — pode usar trend de música)</w:t>
+      </w:r>
+    </w:p>
+    <w:p>
+      <w:pPr/>
+      <w:r>
+        <w:rPr>
+          <w:b w:val="0"/>
+        </w:rPr>
+        <w:t>"Quando eu tô cansado(a) de resolver problema do condomínio... mas lembro da minha motivação."</w:t>
+      </w:r>
+    </w:p>
+    <w:p>
+      <w:pPr/>
+      <w:r>
+        <w:rPr>
+          <w:b/>
+        </w:rPr>
+        <w:t>Legenda</w:t>
+      </w:r>
+    </w:p>
+    <w:p>
+      <w:pPr/>
+      <w:r>
+        <w:rPr>
+          <w:b w:val="0"/>
+        </w:rPr>
+        <w:t>A motivação de quem cuida de condomínio é bem mais simples (e mais rara) do que parece 😅</w:t>
+      </w:r>
+    </w:p>
+    <w:p>
+      <w:pPr/>
+      <w:r>
+        <w:rPr>
+          <w:b w:val="0"/>
+        </w:rPr>
+        <w:t>Marca aqui o síndico ou a síndica que também vive assim.</w:t>
+      </w:r>
+    </w:p>
+    <w:p>
+      <w:pPr/>
+      <w:r>
+        <w:rPr>
+          <w:b/>
+        </w:rPr>
+        <w:t>Stories (sequência de 2)</w:t>
+      </w:r>
+    </w:p>
+    <w:p>
+      <w:pPr/>
+      <w:r>
+        <w:rPr>
+          <w:b w:val="0"/>
+        </w:rPr>
+        <w:t>S1: Vídeo novo no feed — e quem já foi síndico(a) vai se identificar rapidinho.</w:t>
+      </w:r>
+    </w:p>
+    <w:p>
+      <w:pPr/>
+      <w:r>
+        <w:rPr>
+          <w:b w:val="0"/>
+        </w:rPr>
+        <w:t>S2: Assista e marca alguém. 👆</w:t>
       </w:r>
     </w:p>
     <w:p>

</xml_diff>

<commit_message>
Detalha lista de takes para gravação do vídeo de síndico em campo (23/09)
Especifica os 3 takes a repetir para cada síndico individualmente:
escritório (câmera atrás do computador, síndico digitando sem olhar pra
câmera, parte de trás do monitor visível), campo (caminhando pelo
condomínio verificando obra/estrutura/área externa/iluminação, como se
estivesse com prancheta) e conversa amigável simulada com morador.

Adiciona nota consolidada no topo do calendário resumindo a pauta de
gravação atual (11/09, 18/09, 23/09), deixando os demais formatos para
a pauta de outubro.

Co-Authored-By: Claude Sonnet 5 <noreply@anthropic.com>
Claude-Session: https://claude.ai/code/session_01Qco3rELextfq6k1B91gUBk
</commit_message>
<xml_diff>
--- a/strategia-sindicos/calendarios-editoriais/Calendario_Editorial_Strategia_Setembro2026.docx
+++ b/strategia-sindicos/calendarios-editoriais/Calendario_Editorial_Strategia_Setembro2026.docx
@@ -35,6 +35,15 @@
           <w:b w:val="0"/>
         </w:rPr>
         <w:t>Nota: Setembro foi reconstruído a partir da lista de referências de vídeo enviada pelo cliente (posts de outras contas usados como inspiração de formato). O calendário anterior de setembro — com os carrosséis educativos e os vídeos de prova social/síndico em campo — não foi descartado: ele foi realocado para novembro 2026, mantendo as mesmas temáticas, para revisão futura. Este calendário passa a intercalar vídeo de prova social, carrossel e vídeos de síndico em campo, sempre nas quartas e sextas, exceto 30/09 (quarta extra do mês).</w:t>
+      </w:r>
+    </w:p>
+    <w:p>
+      <w:pPr/>
+      <w:r>
+        <w:rPr>
+          <w:b/>
+        </w:rPr>
+        <w:t>PAUTA DE GRAVAÇÃO ATUAL — o que precisa ser filmado agora: (1) 11/09 — síndico(a) respondendo a caixinha de pergunta sobre hall/corredor; (2) 18/09 — síndico(a) falando sobre responsabilidade com o lixo; (3) 23/09 — takes de cada síndico(a) trabalhando (escritório + campo + conversa com morador), ver lista de takes detalhada no dia 23/09. Os demais formatos (25/09, 30/09, 04/09) entram na pauta de gravação de outubro.</w:t>
       </w:r>
     </w:p>
     <w:p>
@@ -1260,7 +1269,7 @@
         <w:rPr>
           <w:b w:val="0"/>
         </w:rPr>
-        <w:t>Temática macro: Banco de imagens do síndico em campo, trabalhando — 2 versões (2 síndicos diferentes)</w:t>
+        <w:t>Temática macro: Banco de imagens do síndico em campo, trabalhando — gravar cada síndico(a) individualmente pra criar material reaproveitável em vários vídeos futuros</w:t>
       </w:r>
     </w:p>
     <w:p>
@@ -1278,7 +1287,16 @@
         <w:rPr>
           <w:b/>
         </w:rPr>
-        <w:t>Conteúdo do vídeo</w:t>
+        <w:t>LISTA DE TAKES PARA GRAVAÇÃO (repetir os 3 takes abaixo pra CADA síndico, individualmente)</w:t>
+      </w:r>
+    </w:p>
+    <w:p>
+      <w:pPr/>
+      <w:r>
+        <w:rPr>
+          <w:b/>
+        </w:rPr>
+        <w:t>Take 1 — No escritório/computador</w:t>
       </w:r>
     </w:p>
     <w:p>
@@ -1287,7 +1305,25 @@
         <w:rPr>
           <w:b w:val="0"/>
         </w:rPr>
-        <w:t>Formato: filmagem crua do síndico(a) trabalhando em campo (vistoria, conversa com prestador, checando área comum) — pouco ou nenhum áudio direto; gancho e legendas adicionados na edição</w:t>
+        <w:t>Câmera posicionada atrás do computador/monitor, enquadrando o síndico(a) trabalhando de frente pra tela</w:t>
+      </w:r>
+    </w:p>
+    <w:p>
+      <w:pPr/>
+      <w:r>
+        <w:rPr>
+          <w:b w:val="0"/>
+        </w:rPr>
+        <w:t>A parte de trás do computador/monitor precisa aparecer no quadro (dá o ponto de vista de "por trás do trabalho")</w:t>
+      </w:r>
+    </w:p>
+    <w:p>
+      <w:pPr/>
+      <w:r>
+        <w:rPr>
+          <w:b w:val="0"/>
+        </w:rPr>
+        <w:t>Síndico(a) digitando, concentrado(a), sem olhar pra câmera em nenhum momento</w:t>
       </w:r>
     </w:p>
     <w:p>
@@ -1296,7 +1332,70 @@
         <w:rPr>
           <w:b/>
         </w:rPr>
-        <w:t>Pedido de produção pra Strategia: gravar CADA síndico(a) separadamente (não precisa ser no mesmo dia), uns 2-3 minutos de material cru por pessoa, em situação real de trabalho — isso cria um banco de imagens reaproveitável pra vários vídeos futuros, não só este post</w:t>
+        <w:t>Take 2 — Em campo, no condomínio</w:t>
+      </w:r>
+    </w:p>
+    <w:p>
+      <w:pPr/>
+      <w:r>
+        <w:rPr>
+          <w:b w:val="0"/>
+        </w:rPr>
+        <w:t>Gravar em um condomínio aberto, com o síndico(a) caminhando e verificando: obra em andamento, estrutura do prédio, área externa, iluminação</w:t>
+      </w:r>
+    </w:p>
+    <w:p>
+      <w:pPr/>
+      <w:r>
+        <w:rPr>
+          <w:b w:val="0"/>
+        </w:rPr>
+        <w:t>Se possível, síndico(a) com prancheta na mão, como se estivesse fazendo uma vistoria/checklist</w:t>
+      </w:r>
+    </w:p>
+    <w:p>
+      <w:pPr/>
+      <w:r>
+        <w:rPr>
+          <w:b w:val="0"/>
+        </w:rPr>
+        <w:t>Câmera acompanha o síndico(a) caminhando e observando (plano de acompanhamento, câmera na mão ou steadycam)</w:t>
+      </w:r>
+    </w:p>
+    <w:p>
+      <w:pPr/>
+      <w:r>
+        <w:rPr>
+          <w:b/>
+        </w:rPr>
+        <w:t>Take 3 — Conversa com morador</w:t>
+      </w:r>
+    </w:p>
+    <w:p>
+      <w:pPr/>
+      <w:r>
+        <w:rPr>
+          <w:b w:val="0"/>
+        </w:rPr>
+        <w:t>Síndico(a) conversando com outra pessoa, simulando uma conversa amigável e informal com um morador do condomínio</w:t>
+      </w:r>
+    </w:p>
+    <w:p>
+      <w:pPr/>
+      <w:r>
+        <w:rPr>
+          <w:b w:val="0"/>
+        </w:rPr>
+        <w:t>Gravar um plano mais aberto captando a interação e também um close nas expressões durante a conversa</w:t>
+      </w:r>
+    </w:p>
+    <w:p>
+      <w:pPr/>
+      <w:r>
+        <w:rPr>
+          <w:b/>
+        </w:rPr>
+        <w:t>Observação: repetir os 3 takes pra cada síndico(a) separadamente (não precisa ser no mesmo dia nem no mesmo condomínio) — isso cria um banco de imagens que dá pra reaproveitar em vários vídeos futuros, não só neste post</w:t>
       </w:r>
     </w:p>
     <w:p>

</xml_diff>

<commit_message>
Ajusta pauta do dia 23/09: só take do computador; move takes de campo e conversa para observação final
- 23/09 volta a usar apenas o take do síndico trabalhando no computador
  (câmera atrás do monitor), vídeo de 10-15s com gancho curto na edição
- Os takes 2 (síndico em campo, vistoria) e 3 (conversa com morador) saem
  do post de 23/09 e viram uma observação ao final do calendário,
  pedindo pra gravarem já esse material como banco de imagens para os
  próximos calendários (outubro, novembro, dezembro), com entrega
  possível ainda em setembro pra acelerar a produção

Co-Authored-By: Claude Sonnet 5 <noreply@anthropic.com>
Claude-Session: https://claude.ai/code/session_01Qco3rELextfq6k1B91gUBk
</commit_message>
<xml_diff>
--- a/strategia-sindicos/calendarios-editoriais/Calendario_Editorial_Strategia_Setembro2026.docx
+++ b/strategia-sindicos/calendarios-editoriais/Calendario_Editorial_Strategia_Setembro2026.docx
@@ -35,15 +35,6 @@
           <w:b w:val="0"/>
         </w:rPr>
         <w:t>Nota: Setembro foi reconstruído a partir da lista de referências de vídeo enviada pelo cliente (posts de outras contas usados como inspiração de formato). O calendário anterior de setembro — com os carrosséis educativos e os vídeos de prova social/síndico em campo — não foi descartado: ele foi realocado para novembro 2026, mantendo as mesmas temáticas, para revisão futura. Este calendário passa a intercalar vídeo de prova social, carrossel e vídeos de síndico em campo, sempre nas quartas e sextas, exceto 30/09 (quarta extra do mês).</w:t>
-      </w:r>
-    </w:p>
-    <w:p>
-      <w:pPr/>
-      <w:r>
-        <w:rPr>
-          <w:b/>
-        </w:rPr>
-        <w:t>PAUTA DE GRAVAÇÃO ATUAL — o que precisa ser filmado agora: (1) 11/09 — síndico(a) respondendo a caixinha de pergunta sobre hall/corredor; (2) 18/09 — síndico(a) falando sobre responsabilidade com o lixo; (3) 23/09 — takes de cada síndico(a) trabalhando (escritório + campo + conversa com morador), ver lista de takes detalhada no dia 23/09. Os demais formatos (25/09, 30/09, 04/09) entram na pauta de gravação de outubro.</w:t>
       </w:r>
     </w:p>
     <w:p>
@@ -1269,7 +1260,7 @@
         <w:rPr>
           <w:b w:val="0"/>
         </w:rPr>
-        <w:t>Temática macro: Banco de imagens do síndico em campo, trabalhando — gravar cada síndico(a) individualmente pra criar material reaproveitável em vários vídeos futuros</w:t>
+        <w:t>Temática macro: Síndico(a) trabalhando no computador — gravar cada síndico(a) individualmente</w:t>
       </w:r>
     </w:p>
     <w:p>
@@ -1287,16 +1278,7 @@
         <w:rPr>
           <w:b/>
         </w:rPr>
-        <w:t>LISTA DE TAKES PARA GRAVAÇÃO (repetir os 3 takes abaixo pra CADA síndico, individualmente)</w:t>
-      </w:r>
-    </w:p>
-    <w:p>
-      <w:pPr/>
-      <w:r>
-        <w:rPr>
-          <w:b/>
-        </w:rPr>
-        <w:t>Take 1 — No escritório/computador</w:t>
+        <w:t>Conteúdo do vídeo</w:t>
       </w:r>
     </w:p>
     <w:p>
@@ -1305,7 +1287,7 @@
         <w:rPr>
           <w:b w:val="0"/>
         </w:rPr>
-        <w:t>Câmera posicionada atrás do computador/monitor, enquadrando o síndico(a) trabalhando de frente pra tela</w:t>
+        <w:t>Formato: vídeo vertical curto, 10 a 15 segundos — câmera posicionada atrás do computador/monitor, enquadrando o síndico(a) trabalhando de frente pra tela</w:t>
       </w:r>
     </w:p>
     <w:p>
@@ -1330,9 +1312,9 @@
       <w:pPr/>
       <w:r>
         <w:rPr>
-          <w:b/>
+          <w:b w:val="0"/>
         </w:rPr>
-        <w:t>Take 2 — Em campo, no condomínio</w:t>
+        <w:t>Repetir esse mesmo take pra cada síndico(a) individualmente</w:t>
       </w:r>
     </w:p>
     <w:p>
@@ -1341,88 +1323,7 @@
         <w:rPr>
           <w:b w:val="0"/>
         </w:rPr>
-        <w:t>Gravar em um condomínio aberto, com o síndico(a) caminhando e verificando: obra em andamento, estrutura do prédio, área externa, iluminação</w:t>
-      </w:r>
-    </w:p>
-    <w:p>
-      <w:pPr/>
-      <w:r>
-        <w:rPr>
-          <w:b w:val="0"/>
-        </w:rPr>
-        <w:t>Se possível, síndico(a) com prancheta na mão, como se estivesse fazendo uma vistoria/checklist</w:t>
-      </w:r>
-    </w:p>
-    <w:p>
-      <w:pPr/>
-      <w:r>
-        <w:rPr>
-          <w:b w:val="0"/>
-        </w:rPr>
-        <w:t>Câmera acompanha o síndico(a) caminhando e observando (plano de acompanhamento, câmera na mão ou steadycam)</w:t>
-      </w:r>
-    </w:p>
-    <w:p>
-      <w:pPr/>
-      <w:r>
-        <w:rPr>
-          <w:b/>
-        </w:rPr>
-        <w:t>Take 3 — Conversa com morador</w:t>
-      </w:r>
-    </w:p>
-    <w:p>
-      <w:pPr/>
-      <w:r>
-        <w:rPr>
-          <w:b w:val="0"/>
-        </w:rPr>
-        <w:t>Síndico(a) conversando com outra pessoa, simulando uma conversa amigável e informal com um morador do condomínio</w:t>
-      </w:r>
-    </w:p>
-    <w:p>
-      <w:pPr/>
-      <w:r>
-        <w:rPr>
-          <w:b w:val="0"/>
-        </w:rPr>
-        <w:t>Gravar um plano mais aberto captando a interação e também um close nas expressões durante a conversa</w:t>
-      </w:r>
-    </w:p>
-    <w:p>
-      <w:pPr/>
-      <w:r>
-        <w:rPr>
-          <w:b/>
-        </w:rPr>
-        <w:t>Observação: repetir os 3 takes pra cada síndico(a) separadamente (não precisa ser no mesmo dia nem no mesmo condomínio) — isso cria um banco de imagens que dá pra reaproveitar em vários vídeos futuros, não só neste post</w:t>
-      </w:r>
-    </w:p>
-    <w:p>
-      <w:pPr/>
-      <w:r>
-        <w:rPr>
-          <w:b w:val="0"/>
-        </w:rPr>
-        <w:t>Gancho sugerido (texto editado por cima): "Enquanto você dormia, alguém já tava resolvendo o problema do seu condomínio."</w:t>
-      </w:r>
-    </w:p>
-    <w:p>
-      <w:pPr/>
-      <w:r>
-        <w:rPr>
-          <w:b/>
-        </w:rPr>
-        <w:t>LINHA OPCIONAL (só se o síndico quiser falar algo em cena, não é obrigatório)</w:t>
-      </w:r>
-    </w:p>
-    <w:p>
-      <w:pPr/>
-      <w:r>
-        <w:rPr>
-          <w:b w:val="0"/>
-        </w:rPr>
-        <w:t>"Bom dia! Hoje eu tô aqui fazendo a vistoria do bloco A."</w:t>
+        <w:t>Gancho sugerido (texto curto, editado por cima do vídeo): "Enquanto você dormia, alguém já tava resolvendo o problema do seu condomínio."</w:t>
       </w:r>
     </w:p>
     <w:p>
@@ -1440,7 +1341,7 @@
         <w:rPr>
           <w:b w:val="0"/>
         </w:rPr>
-        <w:t>Gestão de condomínio não é só planilha. É estar lá, no campo, resolvendo antes de virar problema.</w:t>
+        <w:t>Gestão de condomínio não é só planilha. É estar lá, resolvendo antes de virar problema.</w:t>
       </w:r>
     </w:p>
     <w:p>
@@ -1855,6 +1756,98 @@
         <w:t>S3: Comenta DÚVIDA e manda a sua. 👆</w:t>
       </w:r>
     </w:p>
+    <w:p>
+      <w:pPr>
+        <w:pStyle w:val="Heading2"/>
+      </w:pPr>
+      <w:r>
+        <w:rPr>
+          <w:b w:val="0"/>
+        </w:rPr>
+        <w:t>OBSERVAÇÃO — Material para gravar com antecedência (Outubro / Novembro / Dezembro)</w:t>
+      </w:r>
+    </w:p>
+    <w:p>
+      <w:pPr/>
+      <w:r>
+        <w:rPr>
+          <w:b/>
+        </w:rPr>
+        <w:t>Além dos vídeos já pautados acima, aproveitem as gravações do síndico em campo (dia 23/09) pra já registrar o material abaixo. Não faz parte do post do dia 23/09 — é banco de imagens pra eu usar nos próximos meses (outubro, novembro e dezembro). Se conseguirem entregar ainda ao longo de setembro, já ajuda a acelerar a produção dos próximos calendários.</w:t>
+      </w:r>
+    </w:p>
+    <w:p>
+      <w:pPr/>
+      <w:r>
+        <w:rPr>
+          <w:b/>
+        </w:rPr>
+        <w:t>Take 2 — Em campo, no condomínio</w:t>
+      </w:r>
+    </w:p>
+    <w:p>
+      <w:pPr/>
+      <w:r>
+        <w:rPr>
+          <w:b w:val="0"/>
+        </w:rPr>
+        <w:t>Gravar em um condomínio aberto, com o síndico(a) caminhando e verificando: obra em andamento, estrutura do prédio, área externa, iluminação</w:t>
+      </w:r>
+    </w:p>
+    <w:p>
+      <w:pPr/>
+      <w:r>
+        <w:rPr>
+          <w:b w:val="0"/>
+        </w:rPr>
+        <w:t>Se possível, síndico(a) com prancheta na mão, como se estivesse fazendo uma vistoria/checklist</w:t>
+      </w:r>
+    </w:p>
+    <w:p>
+      <w:pPr/>
+      <w:r>
+        <w:rPr>
+          <w:b w:val="0"/>
+        </w:rPr>
+        <w:t>Câmera acompanha o síndico(a) caminhando e observando (plano de acompanhamento, câmera na mão ou steadycam)</w:t>
+      </w:r>
+    </w:p>
+    <w:p>
+      <w:pPr/>
+      <w:r>
+        <w:rPr>
+          <w:b/>
+        </w:rPr>
+        <w:t>Take 3 — Conversa com morador</w:t>
+      </w:r>
+    </w:p>
+    <w:p>
+      <w:pPr/>
+      <w:r>
+        <w:rPr>
+          <w:b w:val="0"/>
+        </w:rPr>
+        <w:t>Síndico(a) conversando com outra pessoa, simulando uma conversa amigável e informal com um morador do condomínio</w:t>
+      </w:r>
+    </w:p>
+    <w:p>
+      <w:pPr/>
+      <w:r>
+        <w:rPr>
+          <w:b w:val="0"/>
+        </w:rPr>
+        <w:t>Gravar um plano mais aberto captando a interação e também um close nas expressões durante a conversa</w:t>
+      </w:r>
+    </w:p>
+    <w:p>
+      <w:pPr/>
+      <w:r>
+        <w:rPr>
+          <w:b w:val="0"/>
+        </w:rPr>
+        <w:t>Repetir os takes 2 e 3 pra cada síndico(a) separadamente (não precisa ser no mesmo dia nem no mesmo condomínio)</w:t>
+      </w:r>
+    </w:p>
     <w:sectPr>
       <w:pgSz w:w="12240" w:h="15840"/>
       <w:pgMar w:top="1440" w:right="1800" w:bottom="1440" w:left="1800" w:header="720" w:footer="720" w:gutter="0"/>

</xml_diff>

<commit_message>
Especifica quantidade de vídeos por síndico (5 síndicos x 3 takes = 15 vídeos)
Deixa explícito no dia 23/09 e na observação final que a empresa tem 5
síndicos e que cada take precisa ser gravado individualmente com cada
um deles: 5 vídeos no computador (23/09) + 5 em campo (vistoria) + 5
conversando com morador = 15 vídeos ao todo, formando banco de imagens
para outubro, novembro, dezembro e início do ano seguinte.

Co-Authored-By: Claude Sonnet 5 <noreply@anthropic.com>
Claude-Session: https://claude.ai/code/session_01Qco3rELextfq6k1B91gUBk
</commit_message>
<xml_diff>
--- a/strategia-sindicos/calendarios-editoriais/Calendario_Editorial_Strategia_Setembro2026.docx
+++ b/strategia-sindicos/calendarios-editoriais/Calendario_Editorial_Strategia_Setembro2026.docx
@@ -1260,7 +1260,7 @@
         <w:rPr>
           <w:b w:val="0"/>
         </w:rPr>
-        <w:t>Temática macro: Síndico(a) trabalhando no computador — gravar cada síndico(a) individualmente</w:t>
+        <w:t>Temática macro: Síndico(a) trabalhando no computador</w:t>
       </w:r>
     </w:p>
     <w:p>
@@ -1312,9 +1312,9 @@
       <w:pPr/>
       <w:r>
         <w:rPr>
-          <w:b w:val="0"/>
+          <w:b/>
         </w:rPr>
-        <w:t>Repetir esse mesmo take pra cada síndico(a) individualmente</w:t>
+        <w:t>QUANTIDADE: gravar esse mesmo take com CADA UM dos 5 síndicos da empresa — 5 vídeos no total, um por síndico(a)</w:t>
       </w:r>
     </w:p>
     <w:p>
@@ -1773,7 +1773,7 @@
         <w:rPr>
           <w:b/>
         </w:rPr>
-        <w:t>Além dos vídeos já pautados acima, aproveitem as gravações do síndico em campo (dia 23/09) pra já registrar o material abaixo. Não faz parte do post do dia 23/09 — é banco de imagens pra eu usar nos próximos meses (outubro, novembro e dezembro). Se conseguirem entregar ainda ao longo de setembro, já ajuda a acelerar a produção dos próximos calendários.</w:t>
+        <w:t>Além dos 5 vídeos do dia 23/09 (um por síndico, no computador), aproveitem as mesmas gravações pra já registrar o material abaixo. Não faz parte do post do dia 23/09 — é banco de imagens pra eu usar nos próximos meses (outubro, novembro, dezembro e possivelmente início do ano que vem). Se conseguirem entregar ainda ao longo de setembro, já ajuda a acelerar a produção dos próximos calendários.</w:t>
       </w:r>
     </w:p>
     <w:p>
@@ -1782,7 +1782,16 @@
         <w:rPr>
           <w:b/>
         </w:rPr>
-        <w:t>Take 2 — Em campo, no condomínio</w:t>
+        <w:t>QUANTIDADE TOTAL: como são 5 síndicos na empresa, preciso do mesmo vídeo gravado para cada um deles em cada take — ou seja, 5 vídeos de síndico no computador (dia 23/09) + 5 vídeos de síndico em campo (take 2) + 5 vídeos de síndico conversando com morador (take 3) = 15 vídeos ao todo, sendo 1 de cada tipo por síndico(a).</w:t>
+      </w:r>
+    </w:p>
+    <w:p>
+      <w:pPr/>
+      <w:r>
+        <w:rPr>
+          <w:b/>
+        </w:rPr>
+        <w:t>Take 2 — Em campo, no condomínio (5 vídeos — 1 por síndico)</w:t>
       </w:r>
     </w:p>
     <w:p>
@@ -1818,7 +1827,7 @@
         <w:rPr>
           <w:b/>
         </w:rPr>
-        <w:t>Take 3 — Conversa com morador</w:t>
+        <w:t>Take 3 — Conversa com morador (5 vídeos — 1 por síndico)</w:t>
       </w:r>
     </w:p>
     <w:p>
@@ -1845,7 +1854,7 @@
         <w:rPr>
           <w:b w:val="0"/>
         </w:rPr>
-        <w:t>Repetir os takes 2 e 3 pra cada síndico(a) separadamente (não precisa ser no mesmo dia nem no mesmo condomínio)</w:t>
+        <w:t>Repetir os takes 2 e 3 pra cada um dos 5 síndicos separadamente (não precisa ser no mesmo dia nem no mesmo condomínio)</w:t>
       </w:r>
     </w:p>
     <w:sectPr>

</xml_diff>

<commit_message>
Atualiza carrossel de 04/09 com o formato completo de referência (17 cards, imagens geradas por IA)
Reconstrói o carrossel "Como os moradores enxergam o síndico" seguindo
exatamente a estrutura do post de referência (@sindicamilenafontoura):
capa + 15 profissões (manobrista, telefonista, auxiliar de limpeza,
árbitra, cuidadora de cães, juíza, enfermeira, empregada, bombeira,
detetive, mediadora, encanadora, babá, policial, monitora de imagens) +
card de fechamento em super-herói(na). Indica usar a foto de um dos 5
síndicos da Strategia como referência para gerar as imagens por IA em
cada cenário/profissão. Legenda e stories adaptados do post original.

Co-Authored-By: Claude Sonnet 5 <noreply@anthropic.com>
Claude-Session: https://claude.ai/code/session_01Qco3rELextfq6k1B91gUBk
</commit_message>
<xml_diff>
--- a/strategia-sindicos/calendarios-editoriais/Calendario_Editorial_Strategia_Setembro2026.docx
+++ b/strategia-sindicos/calendarios-editoriais/Calendario_Editorial_Strategia_Setembro2026.docx
@@ -212,7 +212,7 @@
         <w:rPr>
           <w:b w:val="0"/>
         </w:rPr>
-        <w:t>Referência: carrossel de comparação/estereótipo (formato "como enxergam x como realmente é")</w:t>
+        <w:t>Referência: carrossel "Como os moradores enxergam a síndica" (@sindicamilenafontoura) — imagens geradas por IA, mostrando a mesma pessoa "fantasiada" em cada profissão</w:t>
       </w:r>
     </w:p>
     <w:p>
@@ -221,7 +221,7 @@
         <w:rPr>
           <w:b w:val="0"/>
         </w:rPr>
-        <w:t>Objetivo: Geração de demanda — quebra de estereótipo e identificação</w:t>
+        <w:t>Objetivo: Geração de demanda — quebra de estereótipo e identificação, com forte apelo de compartilhamento</w:t>
       </w:r>
     </w:p>
     <w:p>
@@ -230,7 +230,7 @@
         <w:rPr>
           <w:b w:val="0"/>
         </w:rPr>
-        <w:t>Temática macro: Como muitos moradores enxergam a síndica x o que ela realmente faz</w:t>
+        <w:t>Temática macro: Como muitos moradores enxergam o(a) síndico(a) x tudo que ele(a) realmente faz</w:t>
       </w:r>
     </w:p>
     <w:p>
@@ -239,7 +239,7 @@
         <w:rPr>
           <w:b w:val="0"/>
         </w:rPr>
-        <w:t>Eixo: Dor: trabalho técnico da síndica reduzido a estereótipo · Desejo: reconhecimento do trabalho real de gestão</w:t>
+        <w:t>Eixo: Dor: trabalho técnico do síndico reduzido a estereótipo · Desejo: reconhecimento do trabalho real de gestão</w:t>
       </w:r>
     </w:p>
     <w:p>
@@ -248,7 +248,16 @@
         <w:rPr>
           <w:b/>
         </w:rPr>
-        <w:t>Cards</w:t>
+        <w:t>PRODUÇÃO: usar como referência a foto de um(a) dos 5 síndicos da Strategia (a definir por vocês) e gerar por IA a mesma pessoa recriada em cada cenário/profissão abaixo — mesmo formato do post de referência, com o nome da "profissão" em texto grande no rodapé de cada card</w:t>
+      </w:r>
+    </w:p>
+    <w:p>
+      <w:pPr/>
+      <w:r>
+        <w:rPr>
+          <w:b/>
+        </w:rPr>
+        <w:t>Cards (17 no total — mesma estrutura do post de referência)</w:t>
       </w:r>
     </w:p>
     <w:p>
@@ -266,7 +275,7 @@
         <w:rPr>
           <w:b w:val="0"/>
         </w:rPr>
-        <w:t>Headline: O que os moradores acham que a síndica faz. E o que ela realmente faz.</w:t>
+        <w:t>Headline: Como os moradores enxergam o(a) síndico(a)</w:t>
       </w:r>
     </w:p>
     <w:p>
@@ -275,7 +284,7 @@
         <w:rPr>
           <w:b w:val="0"/>
         </w:rPr>
-        <w:t>Visual: composição dividida (estereótipo vs. realidade). Texto grande, fundo escuro.</w:t>
+        <w:t>Visual: foto do síndico(a) de referência em ambiente de escritório/condomínio, seta indicando "arraste para o lado". Texto grande, fundo escuro.</w:t>
       </w:r>
     </w:p>
     <w:p>
@@ -284,7 +293,7 @@
         <w:rPr>
           <w:b w:val="0"/>
         </w:rPr>
-        <w:t>Card 2</w:t>
+        <w:t>Card 2 — Manobrista</w:t>
       </w:r>
     </w:p>
     <w:p>
@@ -293,7 +302,7 @@
         <w:rPr>
           <w:b w:val="0"/>
         </w:rPr>
-        <w:t>O estereótipo</w:t>
+        <w:t>Visual: síndico(a) de colete e gravata-borboleta, recebendo as chaves de um carro na entrada de um prédio à noite.</w:t>
       </w:r>
     </w:p>
     <w:p>
@@ -302,7 +311,7 @@
         <w:rPr>
           <w:b w:val="0"/>
         </w:rPr>
-        <w:t>"Fica só de olho em fofoca e reclamação de vizinho." "Só assinou pra não pagar taxa."</w:t>
+        <w:t>Card 3 — Telefonista</w:t>
       </w:r>
     </w:p>
     <w:p>
@@ -311,7 +320,7 @@
         <w:rPr>
           <w:b w:val="0"/>
         </w:rPr>
-        <w:t>Card 3</w:t>
+        <w:t>Visual: síndico(a) de headset, sorrindo, num call center.</w:t>
       </w:r>
     </w:p>
     <w:p>
@@ -320,7 +329,7 @@
         <w:rPr>
           <w:b w:val="0"/>
         </w:rPr>
-        <w:t>A realidade</w:t>
+        <w:t>Card 4 — Auxiliar de limpeza</w:t>
       </w:r>
     </w:p>
     <w:p>
@@ -329,7 +338,7 @@
         <w:rPr>
           <w:b w:val="0"/>
         </w:rPr>
-        <w:t>Agenda manutenção preventiva, acompanha orçamento e prestação de contas, negocia contrato com fornecedor, media conflito com base técnica.</w:t>
+        <w:t>Visual: síndico(a) de uniforme de limpeza, carrinho de produtos de limpeza, higienizando uma superfície.</w:t>
       </w:r>
     </w:p>
     <w:p>
@@ -338,7 +347,7 @@
         <w:rPr>
           <w:b w:val="0"/>
         </w:rPr>
-        <w:t>Card 4</w:t>
+        <w:t>Card 5 — Árbitra</w:t>
       </w:r>
     </w:p>
     <w:p>
@@ -347,7 +356,7 @@
         <w:rPr>
           <w:b w:val="0"/>
         </w:rPr>
-        <w:t>Por que essa percepção existe</w:t>
+        <w:t>Visual: síndico(a) de uniforme de arbitragem, apito na boca, cartão vermelho erguido, estádio de futebol ao fundo.</w:t>
       </w:r>
     </w:p>
     <w:p>
@@ -356,7 +365,7 @@
         <w:rPr>
           <w:b w:val="0"/>
         </w:rPr>
-        <w:t>Trabalho técnico é invisível — só aparece quando dá errado, nunca quando foi prevenido a tempo.</w:t>
+        <w:t>Card 6 — Cuidadora de cães</w:t>
       </w:r>
     </w:p>
     <w:p>
@@ -365,7 +374,7 @@
         <w:rPr>
           <w:b w:val="0"/>
         </w:rPr>
-        <w:t>Card 5</w:t>
+        <w:t>Visual: síndico(a) de jaqueta jeans, cercado(a) de cães e gatos, num canil/área externa.</w:t>
       </w:r>
     </w:p>
     <w:p>
@@ -374,7 +383,7 @@
         <w:rPr>
           <w:b w:val="0"/>
         </w:rPr>
-        <w:t>Como a Strategia atua</w:t>
+        <w:t>Card 7 — Juíza de Direito</w:t>
       </w:r>
     </w:p>
     <w:p>
@@ -383,7 +392,7 @@
         <w:rPr>
           <w:b w:val="0"/>
         </w:rPr>
-        <w:t>Assume a gestão técnica formal, com relatórios e transparência, tirando esse peso pessoal e essa fama injusta de cima de quem é síndico morador.</w:t>
+        <w:t>Visual: síndico(a) de toga, martelo na mão, sentado(a) numa bancada de tribunal com placa de identificação.</w:t>
       </w:r>
     </w:p>
     <w:p>
@@ -392,7 +401,7 @@
         <w:rPr>
           <w:b w:val="0"/>
         </w:rPr>
-        <w:t>Card 6</w:t>
+        <w:t>Card 8 — Enfermeira</w:t>
       </w:r>
     </w:p>
     <w:p>
@@ -401,7 +410,7 @@
         <w:rPr>
           <w:b w:val="0"/>
         </w:rPr>
-        <w:t>Gestão boa não aparece. Ela evita que o problema apareça.</w:t>
+        <w:t>Visual: síndico(a) de jaleco/scrub, estetoscópio, em corredor de hospital.</w:t>
       </w:r>
     </w:p>
     <w:p>
@@ -410,7 +419,7 @@
         <w:rPr>
           <w:b w:val="0"/>
         </w:rPr>
-        <w:t>Visual: frase de impacto, fundo azul escuro.</w:t>
+        <w:t>Card 9 — Empregada (carteira assinada)</w:t>
       </w:r>
     </w:p>
     <w:p>
@@ -419,7 +428,7 @@
         <w:rPr>
           <w:b w:val="0"/>
         </w:rPr>
-        <w:t>Card 7 — CTA</w:t>
+        <w:t>Visual: síndico(a) de uniforme de serviços gerais, segurando a carteira de trabalho aberta, crachá com nome.</w:t>
       </w:r>
     </w:p>
     <w:p>
@@ -428,7 +437,7 @@
         <w:rPr>
           <w:b w:val="0"/>
         </w:rPr>
-        <w:t>Sua síndica ou seu síndico têm o suporte técnico que merecem?</w:t>
+        <w:t>Card 10 — Bombeira</w:t>
       </w:r>
     </w:p>
     <w:p>
@@ -437,7 +446,133 @@
         <w:rPr>
           <w:b w:val="0"/>
         </w:rPr>
-        <w:t>Comente: SÍNDICA e olhe o seu direct.</w:t>
+        <w:t>Visual: síndico(a) de uniforme de bombeiro completo, capacete na mão, caminhão do corpo de bombeiros ao fundo.</w:t>
+      </w:r>
+    </w:p>
+    <w:p>
+      <w:pPr/>
+      <w:r>
+        <w:rPr>
+          <w:b w:val="0"/>
+        </w:rPr>
+        <w:t>Card 11 — Detetive</w:t>
+      </w:r>
+    </w:p>
+    <w:p>
+      <w:pPr/>
+      <w:r>
+        <w:rPr>
+          <w:b w:val="0"/>
+        </w:rPr>
+        <w:t>Visual: síndico(a) de sobretudo e chapéu estilo noir, lupa na mão, rua escura e enevoada.</w:t>
+      </w:r>
+    </w:p>
+    <w:p>
+      <w:pPr/>
+      <w:r>
+        <w:rPr>
+          <w:b w:val="0"/>
+        </w:rPr>
+        <w:t>Card 12 — Mediadora</w:t>
+      </w:r>
+    </w:p>
+    <w:p>
+      <w:pPr/>
+      <w:r>
+        <w:rPr>
+          <w:b w:val="0"/>
+        </w:rPr>
+        <w:t>Visual: síndico(a) sentado(a) numa mesa de reunião, mediando conversa entre duas pessoas, placas "PARTE A" e "PARTE B" na mesa.</w:t>
+      </w:r>
+    </w:p>
+    <w:p>
+      <w:pPr/>
+      <w:r>
+        <w:rPr>
+          <w:b w:val="0"/>
+        </w:rPr>
+        <w:t>Card 13 — Encanadora</w:t>
+      </w:r>
+    </w:p>
+    <w:p>
+      <w:pPr/>
+      <w:r>
+        <w:rPr>
+          <w:b w:val="0"/>
+        </w:rPr>
+        <w:t>Visual: síndico(a) de macacão, ferramenta na mão, consertando cano embaixo da pia.</w:t>
+      </w:r>
+    </w:p>
+    <w:p>
+      <w:pPr/>
+      <w:r>
+        <w:rPr>
+          <w:b w:val="0"/>
+        </w:rPr>
+        <w:t>Card 14 — Babá</w:t>
+      </w:r>
+    </w:p>
+    <w:p>
+      <w:pPr/>
+      <w:r>
+        <w:rPr>
+          <w:b w:val="0"/>
+        </w:rPr>
+        <w:t>Visual: síndico(a) brincando com crianças pequenas no chão de uma sala, ambiente acolhedor.</w:t>
+      </w:r>
+    </w:p>
+    <w:p>
+      <w:pPr/>
+      <w:r>
+        <w:rPr>
+          <w:b w:val="0"/>
+        </w:rPr>
+        <w:t>Card 15 — Policial</w:t>
+      </w:r>
+    </w:p>
+    <w:p>
+      <w:pPr/>
+      <w:r>
+        <w:rPr>
+          <w:b w:val="0"/>
+        </w:rPr>
+        <w:t>Visual: síndico(a) de farda policial, distintivo, viatura ao fundo.</w:t>
+      </w:r>
+    </w:p>
+    <w:p>
+      <w:pPr/>
+      <w:r>
+        <w:rPr>
+          <w:b w:val="0"/>
+        </w:rPr>
+        <w:t>Card 16 — Monitora de imagens</w:t>
+      </w:r>
+    </w:p>
+    <w:p>
+      <w:pPr/>
+      <w:r>
+        <w:rPr>
+          <w:b w:val="0"/>
+        </w:rPr>
+        <w:t>Visual: síndico(a) numa central de monitoramento, apontando pra tela com várias câmeras de segurança.</w:t>
+      </w:r>
+    </w:p>
+    <w:p>
+      <w:pPr/>
+      <w:r>
+        <w:rPr>
+          <w:b w:val="0"/>
+        </w:rPr>
+        <w:t>Card 17 — Super-herói(na) (fechamento)</w:t>
+      </w:r>
+    </w:p>
+    <w:p>
+      <w:pPr/>
+      <w:r>
+        <w:rPr>
+          <w:b w:val="0"/>
+        </w:rPr>
+        <w:t>Visual: síndico(a) em traje de super-herói, capa ao vento, cinto de utilidades com chaves/prancheta/ferramentas, escudo com ícone de prédio no peito, skyline de condomínios ao fundo com placas "Condomínio Residencial [nome]".</w:t>
       </w:r>
     </w:p>
     <w:p>
@@ -455,7 +590,7 @@
         <w:rPr>
           <w:b w:val="0"/>
         </w:rPr>
-        <w:t>Todo mundo acha que sabe o que a síndica faz. Poucos sabem o tanto que ela evita que vire problema.</w:t>
+        <w:t>Você acha que o síndico só administra o condomínio? 🤩</w:t>
       </w:r>
     </w:p>
     <w:p>
@@ -464,7 +599,7 @@
         <w:rPr>
           <w:b w:val="0"/>
         </w:rPr>
-        <w:t>A Strategia assume essa gestão técnica com transparência — e tira essa fama injusta de cima de quem só quis ajudar o próprio prédio.</w:t>
+        <w:t>Na prática, ele também é mediador de conflitos, psicólogo, bombeiro, detetive, engenheiro, conciliador, administrador, gestor financeiro, organizador de eventos, fiscal, ouvidor... e, às vezes, até "pai/mãe" de alguns moradores. 😅</w:t>
       </w:r>
     </w:p>
     <w:p>
@@ -473,7 +608,25 @@
         <w:rPr>
           <w:b w:val="0"/>
         </w:rPr>
-        <w:t>Comente: SÍNDICA e olhe o seu direct — nossa equipe vai te orientar.</w:t>
+        <w:t>Brincadeiras à parte, a gestão condominial é uma profissão que exige conhecimento técnico, atualização constante, inteligência emocional e muita capacidade de tomar decisões.</w:t>
+      </w:r>
+    </w:p>
+    <w:p>
+      <w:pPr/>
+      <w:r>
+        <w:rPr>
+          <w:b w:val="0"/>
+        </w:rPr>
+        <w:t>Por trás de um condomínio organizado, seguro e valorizado, existe muito trabalho que quase ninguém vê.</w:t>
+      </w:r>
+    </w:p>
+    <w:p>
+      <w:pPr/>
+      <w:r>
+        <w:rPr>
+          <w:b w:val="0"/>
+        </w:rPr>
+        <w:t>Comente: SÍNDICO e olhe o seu direct.</w:t>
       </w:r>
     </w:p>
     <w:p>
@@ -491,7 +644,7 @@
         <w:rPr>
           <w:b w:val="0"/>
         </w:rPr>
-        <w:t>S1: O que você acha que uma síndica faz no dia a dia? (caixa de pergunta)</w:t>
+        <w:t>S1: O que você acha que um síndico faz no dia a dia? (caixa de pergunta)</w:t>
       </w:r>
     </w:p>
     <w:p>
@@ -500,7 +653,7 @@
         <w:rPr>
           <w:b w:val="0"/>
         </w:rPr>
-        <w:t>S2: A fama é uma. O trabalho real é outro.</w:t>
+        <w:t>S2: A fama é uma. O trabalho real é outro — e tem muito mais gente escondida aí dentro do que parece.</w:t>
       </w:r>
     </w:p>
     <w:p>
@@ -518,7 +671,7 @@
         <w:rPr>
           <w:b w:val="0"/>
         </w:rPr>
-        <w:t>S4: No carrossel de hoje mostramos a diferença. Salva. 👆</w:t>
+        <w:t>S4: No carrossel de hoje mostramos todas as "profissões" escondidas num síndico. Salva e arrasta pro lado. 👆</w:t>
       </w:r>
     </w:p>
     <w:p>

</xml_diff>

<commit_message>
Atualiza roteiro de 11/09 com o texto literal do áudio de referência enviado
Substitui o roteiro genérico pelo texto real fornecido pelo cliente
(resposta da caixinha de pergunta sobre guardar objetos no
hall/corredor), incluindo a assinatura "Sou síndico(a) [nome] da
Strategia Síndicos Profissionais...". Corrige "o copeiro" para "o Corpo
de Bombeiros" (provável erro de transcrição do áudio original).

Co-Authored-By: Claude Sonnet 5 <noreply@anthropic.com>
Claude-Session: https://claude.ai/code/session_01Qco3rELextfq6k1B91gUBk
</commit_message>
<xml_diff>
--- a/strategia-sindicos/calendarios-editoriais/Calendario_Editorial_Strategia_Setembro2026.docx
+++ b/strategia-sindicos/calendarios-editoriais/Calendario_Editorial_Strategia_Setembro2026.docx
@@ -885,7 +885,16 @@
         <w:rPr>
           <w:b w:val="0"/>
         </w:rPr>
-        <w:t>Formato: Vídeo vertical curto — síndico(a) responde direto pra câmera (ou narração + texto), reaproveitando o formato de caixinha de perguntas dos Stories</w:t>
+        <w:t>Formato: Vídeo vertical curto — síndico(a) responde direto pra câmera, reaproveitando o formato de caixinha de perguntas dos Stories</w:t>
+      </w:r>
+    </w:p>
+    <w:p>
+      <w:pPr/>
+      <w:r>
+        <w:rPr>
+          <w:b/>
+        </w:rPr>
+        <w:t>ROTEIRO PARA GRAVAÇÃO (ler na câmera, texto final — baseado no áudio de referência)</w:t>
       </w:r>
     </w:p>
     <w:p>
@@ -894,7 +903,7 @@
         <w:rPr>
           <w:b w:val="0"/>
         </w:rPr>
-        <w:t>Roteiro — Gancho: leitura da pergunta recebida na caixinha</w:t>
+        <w:t>"O morador pode usar o corredor para guardar sapatos ou decoração?</w:t>
       </w:r>
     </w:p>
     <w:p>
@@ -903,7 +912,7 @@
         <w:rPr>
           <w:b w:val="0"/>
         </w:rPr>
-        <w:t>Roteiro — Corpo: resposta técnica curta — o que diz a convenção/regimento sobre uso de área comum, risco de multa e de obstrução de rota de fuga</w:t>
+        <w:t>A resposta é não, pessoal. Você não pode deixar objetos nas áreas comuns.</w:t>
       </w:r>
     </w:p>
     <w:p>
@@ -912,16 +921,7 @@
         <w:rPr>
           <w:b w:val="0"/>
         </w:rPr>
-        <w:t>Roteiro — Fechamento: convite pra mandar mais perguntas pra caixinha</w:t>
-      </w:r>
-    </w:p>
-    <w:p>
-      <w:pPr/>
-      <w:r>
-        <w:rPr>
-          <w:b/>
-        </w:rPr>
-        <w:t>ROTEIRO PARA GRAVAÇÃO (ler na câmera, pode adaptar com suas palavras)</w:t>
+        <w:t>Imagina um monte de sapatos, ou então alguns objetos grandes de decoração no corredor — ali também é uma rota de fuga. Ou seja, em qualquer alarme de incêndio ou risco de incêndio, é por ali que todo mundo vai sair.</w:t>
       </w:r>
     </w:p>
     <w:p>
@@ -930,7 +930,7 @@
         <w:rPr>
           <w:b w:val="0"/>
         </w:rPr>
-        <w:t>"Chegou essa pergunta pra gente: pode guardar sapato ou enfeite no corredor do prédio?</w:t>
+        <w:t>Imagina sair tropeçando em calçado, ou chutando algum objeto de decoração — isso pode ser um grande problema. E o próprio Corpo de Bombeiros pode dar um "comunique-se" pro condomínio.</w:t>
       </w:r>
     </w:p>
     <w:p>
@@ -939,7 +939,7 @@
         <w:rPr>
           <w:b w:val="0"/>
         </w:rPr>
-        <w:t>Não pode. Área comum não pode virar extensão do apartamento — isso conta como obstrução de rota de fuga e pode gerar multa pro condomínio inteiro, não só pra quem colocou.</w:t>
+        <w:t>Então, não pode deixar objetos na área comum.</w:t>
       </w:r>
     </w:p>
     <w:p>
@@ -948,7 +948,7 @@
         <w:rPr>
           <w:b w:val="0"/>
         </w:rPr>
-        <w:t>Se você tem uma dúvida assim, manda pra gente na caixinha do story. A gente responde por aqui."</w:t>
+        <w:t>Sou síndico(a) [nome] da Strategia Síndicos Profissionais, e se você quer saber mais sobre o dia a dia nos condomínios, nos siga aqui no Instagram."</w:t>
       </w:r>
     </w:p>
     <w:p>

</xml_diff>

<commit_message>
Atualiza vídeo de 16/09 com os textos exatos do vídeo de referência
Alinha o roteiro ao vídeo de referência (10s, sem fala): alguém da
Strategia filmado no computador, com os dois textos exatos a inserir na
edição — "Finalizando o e-mail com 'fico à disposição'" e "Torcendo
para que ninguém precise da minha disposição".

Co-Authored-By: Claude Sonnet 5 <noreply@anthropic.com>
Claude-Session: https://claude.ai/code/session_01Qco3rELextfq6k1B91gUBk
</commit_message>
<xml_diff>
--- a/strategia-sindicos/calendarios-editoriais/Calendario_Editorial_Strategia_Setembro2026.docx
+++ b/strategia-sindicos/calendarios-editoriais/Calendario_Editorial_Strategia_Setembro2026.docx
@@ -1037,7 +1037,7 @@
         <w:rPr>
           <w:b w:val="0"/>
         </w:rPr>
-        <w:t>Referência: vídeo curto e engraçado, sem áudio, ~10 segundos</w:t>
+        <w:t>Referência: vídeo curto e engraçado (~10s), sem falar nada, com texto na tela em 2 cenas</w:t>
       </w:r>
     </w:p>
     <w:p>
@@ -1082,7 +1082,7 @@
         <w:rPr>
           <w:b w:val="0"/>
         </w:rPr>
-        <w:t>Formato: Vídeo mudo (sem áudio), ~10 segundos, cena única com texto na tela estilo meme</w:t>
+        <w:t>Formato: vídeo vertical curto, ~10 segundos, alguém da Strategia sentado(a) na frente do computador/notebook, sem falar nada (áudio ambiente ou música de trend) — os textos abaixo são inseridos na edição</w:t>
       </w:r>
     </w:p>
     <w:p>
@@ -1091,7 +1091,16 @@
         <w:rPr>
           <w:b w:val="0"/>
         </w:rPr>
-        <w:t>Roteiro: síndico(a) digitando uma mensagem longa e educada pro morador, cara de cansaço crescente; texto na tela acompanha a mensagem sendo escrita e termina em "Fico à disposição. Att,"</w:t>
+        <w:t>Roteiro — Cena 1: pessoa digitando no notebook, tela visível, ar tranquilo/neutro</w:t>
+      </w:r>
+    </w:p>
+    <w:p>
+      <w:pPr/>
+      <w:r>
+        <w:rPr>
+          <w:b w:val="0"/>
+        </w:rPr>
+        <w:t>Roteiro — Cena 2: pessoa olha de leve pra câmera/pra cima, expressão cansada ou de alívio</w:t>
       </w:r>
     </w:p>
     <w:p>
@@ -1100,7 +1109,7 @@
         <w:rPr>
           <w:b/>
         </w:rPr>
-        <w:t>TEXTO NA TELA — sequência pra digitar em cena (sem falar nada, vídeo mudo)</w:t>
+        <w:t>TEXTOS PARA INSERIR NA EDIÇÃO (nesta ordem)</w:t>
       </w:r>
     </w:p>
     <w:p>
@@ -1109,7 +1118,7 @@
         <w:rPr>
           <w:b w:val="0"/>
         </w:rPr>
-        <w:t>1. "Bom dia! Recebemos sua mensagem..."</w:t>
+        <w:t>Cena 1: "Finalizando o e-mail com 'fico à disposição'"</w:t>
       </w:r>
     </w:p>
     <w:p>
@@ -1118,25 +1127,7 @@
         <w:rPr>
           <w:b w:val="0"/>
         </w:rPr>
-        <w:t>2. "...vamos verificar e te retornar o mais breve possível..."</w:t>
-      </w:r>
-    </w:p>
-    <w:p>
-      <w:pPr/>
-      <w:r>
-        <w:rPr>
-          <w:b w:val="0"/>
-        </w:rPr>
-        <w:t>3. "Fico à disposição."</w:t>
-      </w:r>
-    </w:p>
-    <w:p>
-      <w:pPr/>
-      <w:r>
-        <w:rPr>
-          <w:b w:val="0"/>
-        </w:rPr>
-        <w:t>4. "Att,"</w:t>
+        <w:t>Cena 2: "Torcendo para que ninguém precise da minha disposição"</w:t>
       </w:r>
     </w:p>
     <w:p>
@@ -1163,7 +1154,7 @@
         <w:rPr>
           <w:b w:val="0"/>
         </w:rPr>
-        <w:t>Se você também "fica à disposição" até esgotado, comenta aqui 👇</w:t>
+        <w:t>Se você também "fica à disposição" torcendo pra ninguém precisar dela, comenta aqui 👇</w:t>
       </w:r>
     </w:p>
     <w:p>

</xml_diff>

<commit_message>
Inverte conteúdo de 16/09 e 18/09 e atualiza roteiro de lixo com referência real
- 16/09 passa a ser o vídeo sobre responsabilidade com o lixo, agora com
  roteiro construído a partir do carrossel de referência real "Café com
  a Síndica" (@susyvrech), incluindo a assinatura padrão do síndico
- 18/09 passa a ser o vídeo mudo de humor "fico à disposição"

Co-Authored-By: Claude Sonnet 5 <noreply@anthropic.com>
Claude-Session: https://claude.ai/code/session_01Qco3rELextfq6k1B91gUBk
</commit_message>
<xml_diff>
--- a/strategia-sindicos/calendarios-editoriais/Calendario_Editorial_Strategia_Setembro2026.docx
+++ b/strategia-sindicos/calendarios-editoriais/Calendario_Editorial_Strategia_Setembro2026.docx
@@ -1037,6 +1037,194 @@
         <w:rPr>
           <w:b w:val="0"/>
         </w:rPr>
+        <w:t>Referência: carrossel de texto "Café com a Síndica — O lixo sai do seu apartamento" (@susyvrech)</w:t>
+      </w:r>
+    </w:p>
+    <w:p>
+      <w:pPr/>
+      <w:r>
+        <w:rPr>
+          <w:b w:val="0"/>
+        </w:rPr>
+        <w:t>Objetivo: Educar / autoridade técnica em tom direto</w:t>
+      </w:r>
+    </w:p>
+    <w:p>
+      <w:pPr/>
+      <w:r>
+        <w:rPr>
+          <w:b w:val="0"/>
+        </w:rPr>
+        <w:t>Temática macro: Lixo sai do seu apartamento, mas a responsabilidade não termina na porta</w:t>
+      </w:r>
+    </w:p>
+    <w:p>
+      <w:pPr/>
+      <w:r>
+        <w:rPr>
+          <w:b w:val="0"/>
+        </w:rPr>
+        <w:t>Eixo: Dor: descarte incorreto de lixo sobrecarrega a equipe e gera problema pro condomínio todo · Desejo: entender até onde vai a responsabilidade de cada um</w:t>
+      </w:r>
+    </w:p>
+    <w:p>
+      <w:pPr/>
+      <w:r>
+        <w:rPr>
+          <w:b/>
+        </w:rPr>
+        <w:t>Conteúdo do vídeo</w:t>
+      </w:r>
+    </w:p>
+    <w:p>
+      <w:pPr/>
+      <w:r>
+        <w:rPr>
+          <w:b w:val="0"/>
+        </w:rPr>
+        <w:t>Formato: síndico(a) da Strategia falando direto pra câmera (ou com teleprompter), transformando o carrossel de referência em um roteiro falado</w:t>
+      </w:r>
+    </w:p>
+    <w:p>
+      <w:pPr/>
+      <w:r>
+        <w:rPr>
+          <w:b/>
+        </w:rPr>
+        <w:t>ROTEIRO PARA GRAVAÇÃO (ler na câmera, baseado nos textos do carrossel de referência)</w:t>
+      </w:r>
+    </w:p>
+    <w:p>
+      <w:pPr/>
+      <w:r>
+        <w:rPr>
+          <w:b w:val="0"/>
+        </w:rPr>
+        <w:t>"O lixo sai do seu apartamento. Mas a responsabilidade não termina na porta.</w:t>
+      </w:r>
+    </w:p>
+    <w:p>
+      <w:pPr/>
+      <w:r>
+        <w:rPr>
+          <w:b w:val="0"/>
+        </w:rPr>
+        <w:t>Separar corretamente, embalar bem e respeitar o local e o horário de descarte parecem atitudes pequenas. Mas fazem uma diferença enorme na rotina do condomínio.</w:t>
+      </w:r>
+    </w:p>
+    <w:p>
+      <w:pPr/>
+      <w:r>
+        <w:rPr>
+          <w:b w:val="0"/>
+        </w:rPr>
+        <w:t>Porque quando alguém descarta errado, alguém precisa recolher, limpar e resolver. E muitas vezes esse alguém é um colaborador que poderia estar cuidando de outras demandas.</w:t>
+      </w:r>
+    </w:p>
+    <w:p>
+      <w:pPr/>
+      <w:r>
+        <w:rPr>
+          <w:b w:val="0"/>
+        </w:rPr>
+        <w:t>Convivência também é pensar no trabalho do outro.</w:t>
+      </w:r>
+    </w:p>
+    <w:p>
+      <w:pPr/>
+      <w:r>
+        <w:rPr>
+          <w:b w:val="0"/>
+        </w:rPr>
+        <w:t>Sou síndico(a) [nome] da Strategia Síndicos Profissionais, e se você quer saber mais sobre o dia a dia nos condomínios, nos siga aqui no Instagram."</w:t>
+      </w:r>
+    </w:p>
+    <w:p>
+      <w:pPr/>
+      <w:r>
+        <w:rPr>
+          <w:b/>
+        </w:rPr>
+        <w:t>Legenda</w:t>
+      </w:r>
+    </w:p>
+    <w:p>
+      <w:pPr/>
+      <w:r>
+        <w:rPr>
+          <w:b w:val="0"/>
+        </w:rPr>
+        <w:t>O lixo pode até sair da porta do seu apartamento. Mas a responsabilidade não termina ali.</w:t>
+      </w:r>
+    </w:p>
+    <w:p>
+      <w:pPr/>
+      <w:r>
+        <w:rPr>
+          <w:b w:val="0"/>
+        </w:rPr>
+        <w:t>Pequenas atitudes — separar direito, embalar bem, respeitar o horário — facilitam o trabalho de quem cuida do condomínio e demonstram respeito por quem divide o mesmo espaço com a gente.</w:t>
+      </w:r>
+    </w:p>
+    <w:p>
+      <w:pPr/>
+      <w:r>
+        <w:rPr>
+          <w:b w:val="0"/>
+        </w:rPr>
+        <w:t>Comente: LIXO e olhe o seu direct.</w:t>
+      </w:r>
+    </w:p>
+    <w:p>
+      <w:pPr/>
+      <w:r>
+        <w:rPr>
+          <w:b/>
+        </w:rPr>
+        <w:t>Stories (sequência de 3)</w:t>
+      </w:r>
+    </w:p>
+    <w:p>
+      <w:pPr/>
+      <w:r>
+        <w:rPr>
+          <w:b w:val="0"/>
+        </w:rPr>
+        <w:t>S1: Você sabe até onde vai a sua responsabilidade com o lixo do condomínio? (enquete: Sei bem / Nunca pensei nisso)</w:t>
+      </w:r>
+    </w:p>
+    <w:p>
+      <w:pPr/>
+      <w:r>
+        <w:rPr>
+          <w:b w:val="0"/>
+        </w:rPr>
+        <w:t>S2: No vídeo de hoje, o síndico explica por que isso importa tanto.</w:t>
+      </w:r>
+    </w:p>
+    <w:p>
+      <w:pPr/>
+      <w:r>
+        <w:rPr>
+          <w:b w:val="0"/>
+        </w:rPr>
+        <w:t>S3: Comenta LIXO no vídeo de hoje. 👆</w:t>
+      </w:r>
+    </w:p>
+    <w:p>
+      <w:pPr>
+        <w:pStyle w:val="Heading2"/>
+      </w:pPr>
+      <w:r>
+        <w:t>Sexta, 18/09</w:t>
+      </w:r>
+    </w:p>
+    <w:p>
+      <w:pPr/>
+      <w:r>
+        <w:rPr>
+          <w:b w:val="0"/>
+        </w:rPr>
         <w:t>Referência: vídeo curto e engraçado (~10s), sem falar nada, com texto na tela em 2 cenas</w:t>
       </w:r>
     </w:p>
@@ -1182,203 +1370,6 @@
           <w:b w:val="0"/>
         </w:rPr>
         <w:t>S2: Assista no feed. 👆</w:t>
-      </w:r>
-    </w:p>
-    <w:p>
-      <w:pPr>
-        <w:pStyle w:val="Heading2"/>
-      </w:pPr>
-      <w:r>
-        <w:t>Sexta, 18/09</w:t>
-      </w:r>
-    </w:p>
-    <w:p>
-      <w:pPr/>
-      <w:r>
-        <w:rPr>
-          <w:b w:val="0"/>
-        </w:rPr>
-        <w:t>Objetivo: Educar / autoridade técnica em tom direto</w:t>
-      </w:r>
-    </w:p>
-    <w:p>
-      <w:pPr/>
-      <w:r>
-        <w:rPr>
-          <w:b w:val="0"/>
-        </w:rPr>
-        <w:t>Temática macro: Lixo sai do seu apartamento, mas a responsabilidade não termina na porta</w:t>
-      </w:r>
-    </w:p>
-    <w:p>
-      <w:pPr/>
-      <w:r>
-        <w:rPr>
-          <w:b w:val="0"/>
-        </w:rPr>
-        <w:t>Eixo: Dor: descarte incorreto de lixo gera multa/problema pro condomínio todo · Desejo: entender até onde vai a responsabilidade de cada um</w:t>
-      </w:r>
-    </w:p>
-    <w:p>
-      <w:pPr/>
-      <w:r>
-        <w:rPr>
-          <w:b/>
-        </w:rPr>
-        <w:t>Conteúdo do vídeo</w:t>
-      </w:r>
-    </w:p>
-    <w:p>
-      <w:pPr/>
-      <w:r>
-        <w:rPr>
-          <w:b w:val="0"/>
-        </w:rPr>
-        <w:t>Formato: pessoa falando com teleprompter (ou apenas narrando) — edição por conta da nossa equipe</w:t>
-      </w:r>
-    </w:p>
-    <w:p>
-      <w:pPr/>
-      <w:r>
-        <w:rPr>
-          <w:b w:val="0"/>
-        </w:rPr>
-        <w:t>Roteiro — Gancho: "Você tira o lixo do seu apartamento e acha que o problema acabou ali. Não acabou."</w:t>
-      </w:r>
-    </w:p>
-    <w:p>
-      <w:pPr/>
-      <w:r>
-        <w:rPr>
-          <w:b w:val="0"/>
-        </w:rPr>
-        <w:t>Roteiro — Corpo: explica o que a convenção prevê sobre descarte (separação, horário, local certo) e o que pode gerar multa pro condomínio inteiro, não só pra quem errou</w:t>
-      </w:r>
-    </w:p>
-    <w:p>
-      <w:pPr/>
-      <w:r>
-        <w:rPr>
-          <w:b w:val="0"/>
-        </w:rPr>
-        <w:t>Roteiro — Fechamento: reforça o papel da gestão profissional em orientar e fiscalizar isso, CTA</w:t>
-      </w:r>
-    </w:p>
-    <w:p>
-      <w:pPr/>
-      <w:r>
-        <w:rPr>
-          <w:b/>
-        </w:rPr>
-        <w:t>ROTEIRO PARA GRAVAÇÃO (ler no teleprompter ou narrar, pode adaptar com suas palavras)</w:t>
-      </w:r>
-    </w:p>
-    <w:p>
-      <w:pPr/>
-      <w:r>
-        <w:rPr>
-          <w:b w:val="0"/>
-        </w:rPr>
-        <w:t>"Você tira o lixo do seu apartamento e acha que o problema acabou ali. Não acabou.</w:t>
-      </w:r>
-    </w:p>
-    <w:p>
-      <w:pPr/>
-      <w:r>
-        <w:rPr>
-          <w:b w:val="0"/>
-        </w:rPr>
-        <w:t>A responsabilidade continua até o lixo ser descartado do jeito certo: separado, no horário certo, no local certo.</w:t>
-      </w:r>
-    </w:p>
-    <w:p>
-      <w:pPr/>
-      <w:r>
-        <w:rPr>
-          <w:b w:val="0"/>
-        </w:rPr>
-        <w:t>Quando isso não acontece, quem paga não é só quem errou — é o condomínio inteiro, com multa e problema de fiscalização.</w:t>
-      </w:r>
-    </w:p>
-    <w:p>
-      <w:pPr/>
-      <w:r>
-        <w:rPr>
-          <w:b w:val="0"/>
-        </w:rPr>
-        <w:t>Gestão profissional existe pra orientar isso antes de virar multa. Se seu condomínio já teve problema com lixo, comenta LIXO aqui embaixo."</w:t>
-      </w:r>
-    </w:p>
-    <w:p>
-      <w:pPr/>
-      <w:r>
-        <w:rPr>
-          <w:b/>
-        </w:rPr>
-        <w:t>Legenda</w:t>
-      </w:r>
-    </w:p>
-    <w:p>
-      <w:pPr/>
-      <w:r>
-        <w:rPr>
-          <w:b w:val="0"/>
-        </w:rPr>
-        <w:t>Lixo fora do lugar, no horário errado ou sem separação não é "detalhezinho" — pode virar multa pro condomínio inteiro, não só pra quem errou.</w:t>
-      </w:r>
-    </w:p>
-    <w:p>
-      <w:pPr/>
-      <w:r>
-        <w:rPr>
-          <w:b w:val="0"/>
-        </w:rPr>
-        <w:t>Assista o vídeo de hoje e entenda até onde vai a responsabilidade de cada morador.</w:t>
-      </w:r>
-    </w:p>
-    <w:p>
-      <w:pPr/>
-      <w:r>
-        <w:rPr>
-          <w:b w:val="0"/>
-        </w:rPr>
-        <w:t>Comente: LIXO e olhe o seu direct.</w:t>
-      </w:r>
-    </w:p>
-    <w:p>
-      <w:pPr/>
-      <w:r>
-        <w:rPr>
-          <w:b/>
-        </w:rPr>
-        <w:t>Stories (sequência de 3)</w:t>
-      </w:r>
-    </w:p>
-    <w:p>
-      <w:pPr/>
-      <w:r>
-        <w:rPr>
-          <w:b w:val="0"/>
-        </w:rPr>
-        <w:t>S1: Você sabe até onde vai a sua responsabilidade com o lixo do condomínio? (enquete: Sei bem / Nunca pensei nisso)</w:t>
-      </w:r>
-    </w:p>
-    <w:p>
-      <w:pPr/>
-      <w:r>
-        <w:rPr>
-          <w:b w:val="0"/>
-        </w:rPr>
-        <w:t>S2: No vídeo de hoje explicamos o que pode virar multa.</w:t>
-      </w:r>
-    </w:p>
-    <w:p>
-      <w:pPr/>
-      <w:r>
-        <w:rPr>
-          <w:b w:val="0"/>
-        </w:rPr>
-        <w:t>S3: Comenta LIXO no vídeo de hoje. 👆</w:t>
       </w:r>
     </w:p>
     <w:p>

</xml_diff>

<commit_message>
Atualiza legenda de 23/09 com o texto de referência sobre riscos de perseguição a condômino
Substitui a legenda genérica pelo texto completo enviado (baseado no
post de @paularonfini.adv): os 6 riscos legais de um síndico perseguir
quem questiona as contas do condomínio, reforçando transparência como
obrigação. Mantém o formato de vídeo do dia (síndico digitando no
computador, sem falar, 5 versões) e ajusta o gancho editado por cima
para "6 riscos GRAVES quando o síndico persegue quem questiona as
contas."

Co-Authored-By: Claude Sonnet 5 <noreply@anthropic.com>
Claude-Session: https://claude.ai/code/session_01Qco3rELextfq6k1B91gUBk
</commit_message>
<xml_diff>
--- a/strategia-sindicos/calendarios-editoriais/Calendario_Editorial_Strategia_Setembro2026.docx
+++ b/strategia-sindicos/calendarios-editoriais/Calendario_Editorial_Strategia_Setembro2026.docx
@@ -1386,7 +1386,7 @@
         <w:rPr>
           <w:b w:val="0"/>
         </w:rPr>
-        <w:t>Objetivo: Prova de trabalho real / geração de demanda — bastidor do síndico profissional</w:t>
+        <w:t>Referência: vídeo de talking-head com legenda longa sobre riscos legais de perseguição a condômino que questiona contas (@paularonfini.adv)</w:t>
       </w:r>
     </w:p>
     <w:p>
@@ -1395,7 +1395,7 @@
         <w:rPr>
           <w:b w:val="0"/>
         </w:rPr>
-        <w:t>Temática macro: Síndico(a) trabalhando no computador</w:t>
+        <w:t>Objetivo: Prova de trabalho real / autoridade técnica — transparência na gestão</w:t>
       </w:r>
     </w:p>
     <w:p>
@@ -1404,7 +1404,16 @@
         <w:rPr>
           <w:b w:val="0"/>
         </w:rPr>
-        <w:t>Eixo: Dor: gestão "invisível", ninguém vê o trabalho real por trás · Desejo: ver quem realmente cuida do condomínio</w:t>
+        <w:t>Temática macro: Síndico(a) trabalhando no computador — os riscos de perseguir quem questiona as contas do condomínio</w:t>
+      </w:r>
+    </w:p>
+    <w:p>
+      <w:pPr/>
+      <w:r>
+        <w:rPr>
+          <w:b w:val="0"/>
+        </w:rPr>
+        <w:t>Eixo: Dor: gestão "invisível" e falta de transparência gera desconfiança e risco jurídico · Desejo: ver uma gestão que presta contas e não teme ser questionada</w:t>
       </w:r>
     </w:p>
     <w:p>
@@ -1458,7 +1467,7 @@
         <w:rPr>
           <w:b w:val="0"/>
         </w:rPr>
-        <w:t>Gancho sugerido (texto curto, editado por cima do vídeo): "Enquanto você dormia, alguém já tava resolvendo o problema do seu condomínio."</w:t>
+        <w:t>Gancho sugerido (texto editado por cima do vídeo): "6 riscos GRAVES quando o síndico persegue quem questiona as contas."</w:t>
       </w:r>
     </w:p>
     <w:p>
@@ -1476,7 +1485,7 @@
         <w:rPr>
           <w:b w:val="0"/>
         </w:rPr>
-        <w:t>Gestão de condomínio não é só planilha. É estar lá, resolvendo antes de virar problema.</w:t>
+        <w:t>⚠️ Quando o síndico persegue quem questiona as contas, o problema não é só financeiro, é estrutural.</w:t>
       </w:r>
     </w:p>
     <w:p>
@@ -1485,7 +1494,97 @@
         <w:rPr>
           <w:b w:val="0"/>
         </w:rPr>
-        <w:t>Comente: EQUIPE e olhe o seu direct.</w:t>
+        <w:t>Questionar despesas, contratos e decisões não é criar conflito. É exercer um direito.</w:t>
+      </w:r>
+    </w:p>
+    <w:p>
+      <w:pPr/>
+      <w:r>
+        <w:rPr>
+          <w:b w:val="0"/>
+        </w:rPr>
+        <w:t>Quando isso gera perseguição, alguns riscos aparecem:</w:t>
+      </w:r>
+    </w:p>
+    <w:p>
+      <w:pPr/>
+      <w:r>
+        <w:rPr>
+          <w:b w:val="0"/>
+        </w:rPr>
+        <w:t>1️⃣ Violação do direito de fiscalização — O condômino pode (e deve) acompanhar a gestão. Impedir isso é irregular.</w:t>
+      </w:r>
+    </w:p>
+    <w:p>
+      <w:pPr/>
+      <w:r>
+        <w:rPr>
+          <w:b w:val="0"/>
+        </w:rPr>
+        <w:t>2️⃣ Abuso de poder — Síndico não é autoridade absoluta. É gestor. E pode ser destituído.</w:t>
+      </w:r>
+    </w:p>
+    <w:p>
+      <w:pPr/>
+      <w:r>
+        <w:rPr>
+          <w:b w:val="0"/>
+        </w:rPr>
+        <w:t>3️⃣ Responsabilização por danos — Exposição, constrangimento ou intimidação podem gerar indenização.</w:t>
+      </w:r>
+    </w:p>
+    <w:p>
+      <w:pPr/>
+      <w:r>
+        <w:rPr>
+          <w:b w:val="0"/>
+        </w:rPr>
+        <w:t>4️⃣ Anulação de decisões — Se houver pressão ou impedimento de participação, assembleias podem ser invalidadas.</w:t>
+      </w:r>
+    </w:p>
+    <w:p>
+      <w:pPr/>
+      <w:r>
+        <w:rPr>
+          <w:b w:val="0"/>
+        </w:rPr>
+        <w:t>5️⃣ Auditoria e investigação — Quando não há transparência, a análise pode sair do condomínio e ir para o Judiciário.</w:t>
+      </w:r>
+    </w:p>
+    <w:p>
+      <w:pPr/>
+      <w:r>
+        <w:rPr>
+          <w:b w:val="0"/>
+        </w:rPr>
+        <w:t>6️⃣ Desvalorização do condomínio — Ambiente de conflito afasta moradores e impacta o valor dos imóveis.</w:t>
+      </w:r>
+    </w:p>
+    <w:p>
+      <w:pPr/>
+      <w:r>
+        <w:rPr>
+          <w:b w:val="0"/>
+        </w:rPr>
+        <w:t>📌 Transparência não é opção. É obrigação.</w:t>
+      </w:r>
+    </w:p>
+    <w:p>
+      <w:pPr/>
+      <w:r>
+        <w:rPr>
+          <w:b w:val="0"/>
+        </w:rPr>
+        <w:t>💾 Salve este conteúdo</w:t>
+      </w:r>
+    </w:p>
+    <w:p>
+      <w:pPr/>
+      <w:r>
+        <w:rPr>
+          <w:b w:val="0"/>
+        </w:rPr>
+        <w:t>📤 Envie para quem mora em condomínio</w:t>
       </w:r>
     </w:p>
     <w:p>
@@ -1503,7 +1602,7 @@
         <w:rPr>
           <w:b w:val="0"/>
         </w:rPr>
-        <w:t>S1: Esse é o lado do trabalho que ninguém vê.</w:t>
+        <w:t>S1: Esse é o lado do trabalho que ninguém vê: transparência, todo dia, mesmo sem ninguém perguntar.</w:t>
       </w:r>
     </w:p>
     <w:p>
@@ -1512,7 +1611,7 @@
         <w:rPr>
           <w:b w:val="0"/>
         </w:rPr>
-        <w:t>S2: Vídeo completo no feed.</w:t>
+        <w:t>S2: Vídeo completo no feed — os 6 riscos de quem persegue quem questiona as contas.</w:t>
       </w:r>
     </w:p>
     <w:p>
@@ -1521,7 +1620,7 @@
         <w:rPr>
           <w:b w:val="0"/>
         </w:rPr>
-        <w:t>S3: Comenta EQUIPE. 👆</w:t>
+        <w:t>S3: Salva e manda pra quem mora em condomínio. 👆</w:t>
       </w:r>
     </w:p>
     <w:p>

</xml_diff>

<commit_message>
Ajusta roteiro de 25/09 com os 3 momentos exatos do vídeo de referência
Alinha o vídeo (15-20s, sem falar) aos 3 momentos mostrados nos prints
de referência (@meccamartinelli.advogados): síndico(a) cansado(a) na
mesa com porta-retrato de costas, pegando o porta-retrato, e o reveal
com a palavra escrita à mão dentro dele (ex.: "BOLETOS"). Substitui a
estrutura genérica anterior por essa sequência específica.

Co-Authored-By: Claude Sonnet 5 <noreply@anthropic.com>
Claude-Session: https://claude.ai/code/session_01Qco3rELextfq6k1B91gUBk
</commit_message>
<xml_diff>
--- a/strategia-sindicos/calendarios-editoriais/Calendario_Editorial_Strategia_Setembro2026.docx
+++ b/strategia-sindicos/calendarios-editoriais/Calendario_Editorial_Strategia_Setembro2026.docx
@@ -1637,7 +1637,7 @@
         <w:rPr>
           <w:b w:val="0"/>
         </w:rPr>
-        <w:t>Referência: vídeo de humor curtinho — pessoa cansada na mesa de trabalho + texto de motivação, corte pra um porta-retrato com uma "foto" irônica dentro</w:t>
+        <w:t>Referência: vídeo de humor (@meccamartinelli.advogados) — pessoa cansada na mesa de trabalho + texto de motivação, revela um porta-retrato com uma "foto" irônica escrita à mão dentro</w:t>
       </w:r>
     </w:p>
     <w:p>
@@ -1682,7 +1682,7 @@
         <w:rPr>
           <w:b w:val="0"/>
         </w:rPr>
-        <w:t>Formato: vídeo vertical curto (10-15s), com música/trend de fundo — síndico(a) sentado(a) na mesa, ar cansado, texto na tela aparece, depois corta pra um porta-retrato mostrado em cena</w:t>
+        <w:t>Formato: vídeo vertical, 15 a 20 segundos, SEM FALAR — gravar com um dos síndicos da Strategia, em 3 momentos (igual aos prints de referência)</w:t>
       </w:r>
     </w:p>
     <w:p>
@@ -1691,7 +1691,7 @@
         <w:rPr>
           <w:b w:val="0"/>
         </w:rPr>
-        <w:t>Roteiro — Cena 1: síndico(a) sentado(a) à mesa (computador/planilha ao fundo), expressão de cansaço, olhando pro lado</w:t>
+        <w:t>Momento 1: síndico(a) sentado(a) à mesa de trabalho, notebook aberto, ar cansado, digitando/mexendo no computador; na mesa, um porta-retrato virado de costas pra câmera</w:t>
       </w:r>
     </w:p>
     <w:p>
@@ -1700,7 +1700,7 @@
         <w:rPr>
           <w:b w:val="0"/>
         </w:rPr>
-        <w:t>Roteiro — Cena 2: pega um porta-retrato e mostra pra câmera — dentro do porta-retrato, no lugar de uma foto, está escrito à mão algo como "TAXA EM DIA" ou "GRUPO DO WHATSAPP SEM DRAMA HOJE" (escolher a frase mais engraçada/real pro dia a dia de vocês)</w:t>
+        <w:t>Momento 2: síndico(a) pega o porta-retrato com as duas mãos e olha pra ele, ainda de costas pra câmera</w:t>
       </w:r>
     </w:p>
     <w:p>
@@ -1709,7 +1709,7 @@
         <w:rPr>
           <w:b w:val="0"/>
         </w:rPr>
-        <w:t>Roteiro — Fechamento: síndico(a) sorri/balança a cabeça, sem falar nada, vídeo termina</w:t>
+        <w:t>Momento 3: reveal — câmera mostra o porta-retrato de frente, com uma palavra escrita à mão dentro dele no lugar de uma foto (ex.: "BOLETOS", "TAXA CONDOMINIAL" ou "MORADORES EM DIA" — escolher a mais engraçada/real pro dia a dia de vocês)</w:t>
       </w:r>
     </w:p>
     <w:p>
@@ -1718,7 +1718,7 @@
         <w:rPr>
           <w:b/>
         </w:rPr>
-        <w:t>TEXTO NA TELA (aparece por cima da Cena 1, sem áudio de fala — pode usar trend de música)</w:t>
+        <w:t>TEXTO NA TELA (aparece nos Momentos 1 e 2, sem áudio de fala)</w:t>
       </w:r>
     </w:p>
     <w:p>
@@ -1727,7 +1727,7 @@
         <w:rPr>
           <w:b w:val="0"/>
         </w:rPr>
-        <w:t>"Quando eu tô cansado(a) de resolver problema do condomínio... mas lembro da minha motivação."</w:t>
+        <w:t>"Quando estou cansado(a) no trabalho, mas lembro da minha motivação."</w:t>
       </w:r>
     </w:p>
     <w:p>

</xml_diff>

<commit_message>
Fecha o calendário de setembro: roteiro de 30/09 e banco de roteiros pra outubro/novembro
- 30/09 recebe o roteiro literal da Parte 1 do áudio de referência
  "pode / não pode" (furadeira no domingo, corte de água de
  inadimplente, churrasco na sacada gourmet, desconto pra
  inadimplente)
- Adiciona seção final "BANCO DE ROTEIROS" com as Partes 2, 3 e 4 do
  mesmo áudio, já roteirizadas e com data sugerida (09/10, 23/10,
  06/11), prontas pra entrar nos próximos calendários

Com isso o calendário de setembro fica com todos os 9 dias
detalhados (objetivo, roteiro de gravação, legenda e stories).

Co-Authored-By: Claude Sonnet 5 <noreply@anthropic.com>
Claude-Session: https://claude.ai/code/session_01Qco3rELextfq6k1B91gUBk
</commit_message>
<xml_diff>
--- a/strategia-sindicos/calendarios-editoriais/Calendario_Editorial_Strategia_Setembro2026.docx
+++ b/strategia-sindicos/calendarios-editoriais/Calendario_Editorial_Strategia_Setembro2026.docx
@@ -1798,7 +1798,7 @@
         <w:rPr>
           <w:b w:val="0"/>
         </w:rPr>
-        <w:t>Referência: vídeo em formato lista rápida "pode / não pode"</w:t>
+        <w:t>Referência: áudio de perguntas e respostas rápidas "pode / não pode" — dividido em 4 partes, esta é a Parte 1 de 4 (as demais entram nos calendários de outubro e novembro)</w:t>
       </w:r>
     </w:p>
     <w:p>
@@ -1816,7 +1816,7 @@
         <w:rPr>
           <w:b w:val="0"/>
         </w:rPr>
-        <w:t>Temática macro: O que pode e o que não pode no condomínio</w:t>
+        <w:t>Temática macro: O que pode e o que não pode no condomínio — Parte 1</w:t>
       </w:r>
     </w:p>
     <w:p>
@@ -1843,7 +1843,7 @@
         <w:rPr>
           <w:b w:val="0"/>
         </w:rPr>
-        <w:t>Formato: vídeo dinâmico em formato lista "Pode / Não pode", texto grande na tela alternando os dois lados (com ou sem narração/teleprompter)</w:t>
+        <w:t>Formato: vídeo dinâmico em formato pergunta e resposta rápida "Pode / Não pode", texto grande na tela alternando pergunta e resposta (com ou sem narração/teleprompter)</w:t>
       </w:r>
     </w:p>
     <w:p>
@@ -1852,7 +1852,7 @@
         <w:rPr>
           <w:b/>
         </w:rPr>
-        <w:t>Roteiro — pares "pode / não pode" (ver texto completo no roteiro de gravação abaixo):</w:t>
+        <w:t>ROTEIRO PARA GRAVAÇÃO (ler no teleprompter ou narrar — texto literal do áudio de referência)</w:t>
       </w:r>
     </w:p>
     <w:p>
@@ -1861,16 +1861,7 @@
         <w:rPr>
           <w:b w:val="0"/>
         </w:rPr>
-        <w:t>Roteiro — Fechamento: convite pra mandar dúvidas específicas</w:t>
-      </w:r>
-    </w:p>
-    <w:p>
-      <w:pPr/>
-      <w:r>
-        <w:rPr>
-          <w:b/>
-        </w:rPr>
-        <w:t>ROTEIRO PARA GRAVAÇÃO (ler no teleprompter ou narrar, pode adaptar com suas palavras)</w:t>
+        <w:t>"Usar furadeira no domingo? Não pode, é proibido pela convenção.</w:t>
       </w:r>
     </w:p>
     <w:p>
@@ -1879,7 +1870,7 @@
         <w:rPr>
           <w:b w:val="0"/>
         </w:rPr>
-        <w:t>"Vamos separar o que pode e o que não pode no seu condomínio.</w:t>
+        <w:t>Cortar água do inadimplente? Também não pode — traz um risco danado pro síndico.</w:t>
       </w:r>
     </w:p>
     <w:p>
@@ -1888,7 +1879,7 @@
         <w:rPr>
           <w:b w:val="0"/>
         </w:rPr>
-        <w:t>Pode furar a parede pra pendurar um quadro. Não pode furar parede estrutural sem laudo técnico.</w:t>
+        <w:t>Fazer churrasco na sacada? Se for sacada gourmet, aí pode.</w:t>
       </w:r>
     </w:p>
     <w:p>
@@ -1897,7 +1888,7 @@
         <w:rPr>
           <w:b w:val="0"/>
         </w:rPr>
-        <w:t>Pode alugar o salão de festas. Não pode fazer festa depois do horário combinado sem autorização.</w:t>
+        <w:t>Dar desconto na dívida de inadimplente? Se para quem paga em dia não tem desconto, quem paga atrasado também não deve ter. Não pode.</w:t>
       </w:r>
     </w:p>
     <w:p>
@@ -1906,25 +1897,7 @@
         <w:rPr>
           <w:b w:val="0"/>
         </w:rPr>
-        <w:t>Pode ter pet no apartamento. Não pode deixar ele solto, sem coleira, na área comum.</w:t>
-      </w:r>
-    </w:p>
-    <w:p>
-      <w:pPr/>
-      <w:r>
-        <w:rPr>
-          <w:b w:val="0"/>
-        </w:rPr>
-        <w:t>Pode reformar dentro do seu apê. Não pode reformar sem avisar a administração antes.</w:t>
-      </w:r>
-    </w:p>
-    <w:p>
-      <w:pPr/>
-      <w:r>
-        <w:rPr>
-          <w:b w:val="0"/>
-        </w:rPr>
-        <w:t>Ficou com dúvida sobre alguma regra do seu condomínio? Comenta DÚVIDA aqui embaixo."</w:t>
+        <w:t>E pra saber mais sobre isso? Aí é só seguir a Strategia Síndicos!"</w:t>
       </w:r>
     </w:p>
     <w:p>
@@ -1998,7 +1971,7 @@
         <w:rPr>
           <w:b w:val="0"/>
         </w:rPr>
-        <w:t>OBSERVAÇÃO — Material para gravar com antecedência (Outubro / Novembro / Dezembro)</w:t>
+        <w:t>BANCO DE ROTEIROS — "Pode / Não pode" (Partes 2, 3 e 4 — usar em outubro e novembro)</w:t>
       </w:r>
     </w:p>
     <w:p>
@@ -2007,7 +1980,7 @@
         <w:rPr>
           <w:b/>
         </w:rPr>
-        <w:t>Além dos 5 vídeos do dia 23/09 (um por síndico, no computador), aproveitem as mesmas gravações pra já registrar o material abaixo. Não faz parte do post do dia 23/09 — é banco de imagens pra eu usar nos próximos meses (outubro, novembro, dezembro e possivelmente início do ano que vem). Se conseguirem entregar ainda ao longo de setembro, já ajuda a acelerar a produção dos próximos calendários.</w:t>
+        <w:t>Mesmo áudio de referência, dividido em 4 vídeos. A Parte 1 foi usada em 30/09. As partes abaixo ficam reservadas pra entrar nos próximos calendários, nas datas sugeridas pelo cliente.</w:t>
       </w:r>
     </w:p>
     <w:p>
@@ -2016,7 +1989,52 @@
         <w:rPr>
           <w:b/>
         </w:rPr>
-        <w:t>QUANTIDADE TOTAL: como são 5 síndicos na empresa, preciso do mesmo vídeo gravado para cada um deles em cada take — ou seja, 5 vídeos de síndico no computador (dia 23/09) + 5 vídeos de síndico em campo (take 2) + 5 vídeos de síndico conversando com morador (take 3) = 15 vídeos ao todo, sendo 1 de cada tipo por síndico(a).</w:t>
+        <w:t>Parte 2 — sugerida para 09/10</w:t>
+      </w:r>
+    </w:p>
+    <w:p>
+      <w:pPr/>
+      <w:r>
+        <w:rPr>
+          <w:b w:val="0"/>
+        </w:rPr>
+        <w:t>"Liberar visitante sem cadastro? Aí você está comprometendo a segurança do teu condomínio, não pode.</w:t>
+      </w:r>
+    </w:p>
+    <w:p>
+      <w:pPr/>
+      <w:r>
+        <w:rPr>
+          <w:b w:val="0"/>
+        </w:rPr>
+        <w:t>Instalar carregador de carro elétrico? Sim, pode — é permitido instalar carregador elétrico em condomínio no Rio Grande do Sul, desde que sejam respeitadas as normas técnicas de segurança e a capacidade da rede elétrica do edifício. Nos demais estados, verifique a legislação vigente.</w:t>
+      </w:r>
+    </w:p>
+    <w:p>
+      <w:pPr/>
+      <w:r>
+        <w:rPr>
+          <w:b w:val="0"/>
+        </w:rPr>
+        <w:t>Instalar cobertura de garagem? Pode, se for aprovada em assembleia. E se eu quiser instalar sozinho? Se for sozinho, não pode — e ainda vai te trazer um prejuízo.</w:t>
+      </w:r>
+    </w:p>
+    <w:p>
+      <w:pPr/>
+      <w:r>
+        <w:rPr>
+          <w:b w:val="0"/>
+        </w:rPr>
+        <w:t>Cadastrar a namorada como moradora? Não pode, se ainda não estiver numa união estável.</w:t>
+      </w:r>
+    </w:p>
+    <w:p>
+      <w:pPr/>
+      <w:r>
+        <w:rPr>
+          <w:b w:val="0"/>
+        </w:rPr>
+        <w:t>E pra saber mais sobre isso? Aí é só seguir a Strategia Síndicos!"</w:t>
       </w:r>
     </w:p>
     <w:p>
@@ -2025,7 +2043,7 @@
         <w:rPr>
           <w:b/>
         </w:rPr>
-        <w:t>Take 2 — Em campo, no condomínio (5 vídeos — 1 por síndico)</w:t>
+        <w:t>Parte 3 — sugerida para 23/10</w:t>
       </w:r>
     </w:p>
     <w:p>
@@ -2034,7 +2052,7 @@
         <w:rPr>
           <w:b w:val="0"/>
         </w:rPr>
-        <w:t>Gravar em um condomínio aberto, com o síndico(a) caminhando e verificando: obra em andamento, estrutura do prédio, área externa, iluminação</w:t>
+        <w:t>"Fumar no apartamento? Se está prejudicando a saúde do teu vizinho, também não pode.</w:t>
       </w:r>
     </w:p>
     <w:p>
@@ -2043,7 +2061,7 @@
         <w:rPr>
           <w:b w:val="0"/>
         </w:rPr>
-        <w:t>Se possível, síndico(a) com prancheta na mão, como se estivesse fazendo uma vistoria/checklist</w:t>
+        <w:t>Receber visita de madrugada? Pode, não existe limitação de horário.</w:t>
       </w:r>
     </w:p>
     <w:p>
@@ -2052,7 +2070,25 @@
         <w:rPr>
           <w:b w:val="0"/>
         </w:rPr>
-        <w:t>Câmera acompanha o síndico(a) caminhando e observando (plano de acompanhamento, câmera na mão ou steadycam)</w:t>
+        <w:t>Usar o apartamento residencial para atendimento comercial? Se tem atendimento ao público, não pode.</w:t>
+      </w:r>
+    </w:p>
+    <w:p>
+      <w:pPr/>
+      <w:r>
+        <w:rPr>
+          <w:b w:val="0"/>
+        </w:rPr>
+        <w:t>Carro maior que a vaga de garagem? Você pode até ter, mas estacionar dentro do condomínio, não pode.</w:t>
+      </w:r>
+    </w:p>
+    <w:p>
+      <w:pPr/>
+      <w:r>
+        <w:rPr>
+          <w:b w:val="0"/>
+        </w:rPr>
+        <w:t>E pra saber mais sobre isso? Aí é só seguir a Strategia Síndicos!"</w:t>
       </w:r>
     </w:p>
     <w:p>
@@ -2061,7 +2097,7 @@
         <w:rPr>
           <w:b/>
         </w:rPr>
-        <w:t>Take 3 — Conversa com morador (5 vídeos — 1 por síndico)</w:t>
+        <w:t>Parte 4 — sugerida para 06/11</w:t>
       </w:r>
     </w:p>
     <w:p>
@@ -2070,7 +2106,7 @@
         <w:rPr>
           <w:b w:val="0"/>
         </w:rPr>
-        <w:t>Síndico(a) conversando com outra pessoa, simulando uma conversa amigável e informal com um morador do condomínio</w:t>
+        <w:t>"Fazer culto religioso no apartamento? Pode, se respeitar as regras do condomínio e não atrapalhar os vizinhos.</w:t>
       </w:r>
     </w:p>
     <w:p>
@@ -2079,7 +2115,7 @@
         <w:rPr>
           <w:b w:val="0"/>
         </w:rPr>
-        <w:t>Gravar um plano mais aberto captando a interação e também um close nas expressões durante a conversa</w:t>
+        <w:t>E culto no salão de festas? No salão de festas não pode.</w:t>
       </w:r>
     </w:p>
     <w:p>
@@ -2088,7 +2124,25 @@
         <w:rPr>
           <w:b w:val="0"/>
         </w:rPr>
-        <w:t>Repetir os takes 2 e 3 pra cada um dos 5 síndicos separadamente (não precisa ser no mesmo dia nem no mesmo condomínio)</w:t>
+        <w:t>Deixar sapatos na porta do condomínio, na parte de fora? Não pode.</w:t>
+      </w:r>
+    </w:p>
+    <w:p>
+      <w:pPr/>
+      <w:r>
+        <w:rPr>
+          <w:b w:val="0"/>
+        </w:rPr>
+        <w:t>Instalar câmera na porta? Câmera na porta vai contra a LGPD, também não pode.</w:t>
+      </w:r>
+    </w:p>
+    <w:p>
+      <w:pPr/>
+      <w:r>
+        <w:rPr>
+          <w:b w:val="0"/>
+        </w:rPr>
+        <w:t>E pra saber mais sobre isso? Aí é só seguir a Strategia Síndicos!"</w:t>
       </w:r>
     </w:p>
     <w:sectPr>

</xml_diff>

<commit_message>
Especifica quem aparece em cada vídeo de prova social (02/09 e 09/09)
02/09: depoimento de moradora, falando direto pra câmera dentro do
carro. 09/09: depoimento de morador (senhor), falando direto pra
câmera em casa. Ambos os vídeos já estão gravados, falta apenas a
edição por parte do cliente.

Co-Authored-By: Claude Sonnet 5 <noreply@anthropic.com>
Claude-Session: https://claude.ai/code/session_01Qco3rELextfq6k1B91gUBk
</commit_message>
<xml_diff>
--- a/strategia-sindicos/calendarios-editoriais/Calendario_Editorial_Strategia_Setembro2026.docx
+++ b/strategia-sindicos/calendarios-editoriais/Calendario_Editorial_Strategia_Setembro2026.docx
@@ -60,7 +60,7 @@
         <w:rPr>
           <w:b w:val="0"/>
         </w:rPr>
-        <w:t>Temática macro: Depoimento de condomínio atendido pela Strategia</w:t>
+        <w:t>Temática macro: Depoimento de moradora, falando direto pra câmera dentro do carro, sobre a gestão da Strategia</w:t>
       </w:r>
     </w:p>
     <w:p>
@@ -697,7 +697,7 @@
         <w:rPr>
           <w:b w:val="0"/>
         </w:rPr>
-        <w:t>Temática macro: Segundo depoimento de condomínio atendido pela Strategia</w:t>
+        <w:t>Temática macro: Depoimento de morador (senhor), falando direto pra câmera em casa, sobre os síndicos da Strategia</w:t>
       </w:r>
     </w:p>
     <w:p>

</xml_diff>

<commit_message>
Adiciona links do Drive nos conteúdos prontos (02/09, 04/09, 09/09) e ajusta formato de 16/09
- Insere o link do Google Drive de cada material já pronto (reels
  02/09 e 09/09, carrossel 04/09) logo abaixo do status de produção
- 16/09: remove a menção a "transformar o carrossel de referência em
  roteiro falado" do campo de formato, deixando apenas "síndico(a) da
  Strategia falando diretamente para a câmera. Pode usar o
  teleprompter ou falar com as próprias palavras."
- Regenera o PDF com os links como hyperlinks clicáveis

Co-Authored-By: Claude Sonnet 5 <noreply@anthropic.com>
Claude-Session: https://claude.ai/code/session_01Qco3rELextfq6k1B91gUBk
</commit_message>
<xml_diff>
--- a/strategia-sindicos/calendarios-editoriais/Calendario_Editorial_Strategia_Setembro2026.docx
+++ b/strategia-sindicos/calendarios-editoriais/Calendario_Editorial_Strategia_Setembro2026.docx
@@ -224,6 +224,15 @@
         <w:rPr>
           <w:rtl w:val="0"/>
         </w:rPr>
+      </w:r>
+    </w:p>
+    <w:p>
+      <w:pPr/>
+      <w:r>
+        <w:rPr>
+          <w:b/>
+        </w:rPr>
+        <w:t>Link: https://drive.google.com/file/d/1nYsR9Q3PLcrlGW4kTVMWeC0uApdK5CBb/view?usp=drive_link</w:t>
       </w:r>
     </w:p>
     <w:p>
@@ -598,6 +607,15 @@
       </w:r>
     </w:p>
     <w:p>
+      <w:pPr/>
+      <w:r>
+        <w:rPr>
+          <w:b/>
+        </w:rPr>
+        <w:t>Link: https://drive.google.com/file/d/1cKAX_url2sv6bEaQQClzzm8LR7NrLVxD/view?usp=drive_link</w:t>
+      </w:r>
+    </w:p>
+    <w:p>
       <w:pPr>
         <w:rPr/>
       </w:pPr>
@@ -1465,6 +1483,21 @@
           <w:rtl w:val="0"/>
         </w:rPr>
         <w:t xml:space="preserve">Status de produção: Vídeo já gravado e editado </w:t>
+      </w:r>
+    </w:p>
+    <w:p>
+      <w:pPr>
+        <w:rPr>
+          <w:b w:val="1"/>
+          <w:bCs w:val="1"/>
+          <w:highlight w:val="yellow"/>
+        </w:rPr>
+      </w:pPr>
+      <w:r>
+        <w:rPr>
+          <w:b/>
+        </w:rPr>
+        <w:t>Link: https://drive.google.com/file/d/1cr1ZTjaL96oqtaWbFPi-Q0XmPPQWOouU/view?usp=drive_link</w:t>
       </w:r>
     </w:p>
     <w:p>
@@ -2274,7 +2307,7 @@
           <w:bCs w:val="0"/>
           <w:rtl w:val="0"/>
         </w:rPr>
-        <w:t xml:space="preserve">Formato: síndico(a) da Strategia falando direto pra câmera (ou com teleprompter), transformando o carrossel de referência em um roteiro falado</w:t>
+        <w:t>Formato: síndico(a) da Strategia falando diretamente para a câmera. Pode usar o teleprompter ou falar com as próprias palavras.</w:t>
       </w:r>
       <w:r>
         <w:rPr>

</xml_diff>

<commit_message>
Detalha observação de gravação do dia 23/09 (5 vídeos, 1 por síndico)
Reescreve a instrução de produção do dia 23/09: gravar um vídeo de
10-15s com cada um dos 5 síndicos, câmera no ângulo que mostre a parte
de trás do computador/tampa do notebook e o síndico digitando
concentrado, salvar em alta resolução. Referencia o mesmo ângulo do
vídeo "fico à disposição" (18/09) como parâmetro visual — a cliente
mandou um print de exemplo, mas ele veio colado direto na mensagem
(sem vir como arquivo anexado), então não foi possível salvá-lo e
embutir a imagem no documento; a referência ficou descrita em texto.

Co-Authored-By: Claude Sonnet 5 <noreply@anthropic.com>
Claude-Session: https://claude.ai/code/session_01Qco3rELextfq6k1B91gUBk
</commit_message>
<xml_diff>
--- a/strategia-sindicos/calendarios-editoriais/Calendario_Editorial_Strategia_Setembro2026.docx
+++ b/strategia-sindicos/calendarios-editoriais/Calendario_Editorial_Strategia_Setembro2026.docx
@@ -3161,11 +3161,11 @@
       </w:pPr>
       <w:r>
         <w:rPr>
-          <w:b w:val="1"/>
-          <w:bCs w:val="1"/>
-          <w:rtl w:val="0"/>
-        </w:rPr>
-        <w:t xml:space="preserve">QUANTIDADE: gravar esse mesmo take com CADA UM dos 5 síndicos da empresa — 5 vídeos no total, um por síndico(a), assim, teremos materiais para vários meses.</w:t>
+          <w:b/>
+          <w:bCs w:val="1"/>
+          <w:rtl w:val="0"/>
+        </w:rPr>
+        <w:t>OBSERVAÇÃO: Gravar um vídeo com CADA UM dos 5 síndicos — ou seja, 5 vídeos no total, pra termos material pra trabalhar nos próximos meses. O vídeo é simples: de 10 a 15 segundos, síndico(a) trabalhando no computador, câmera no ângulo que mostre a parte de trás do computador/tampa do notebook e o síndico(a) digitando, concentrado(a) (sem olhar pra câmera). Fazer isso com cada um dos síndicos e salvar em alta resolução. Referência de enquadramento: mesmo ângulo do vídeo do "fico à disposição" (câmera atrás do notebook, mostrando a tela/tampa e a pessoa trabalhando de frente).</w:t>
       </w:r>
       <w:r>
         <w:rPr>

</xml_diff>

<commit_message>
Adiciona link de referência e fixa a palavra BOLETOS no vídeo de 25/09
Insere o link do vídeo de referência (Instagram) no campo de formato do
dia 25/09, e substitui as opções de palavra do reveal do porta-retrato
por apenas "BOLETOS", conforme pedido — remove "TAXA CONDOMINIAL" e
"MORADORES EM DIA".

Co-Authored-By: Claude Sonnet 5 <noreply@anthropic.com>
Claude-Session: https://claude.ai/code/session_01Qco3rELextfq6k1B91gUBk
</commit_message>
<xml_diff>
--- a/strategia-sindicos/calendarios-editoriais/Calendario_Editorial_Strategia_Setembro2026.docx
+++ b/strategia-sindicos/calendarios-editoriais/Calendario_Editorial_Strategia_Setembro2026.docx
@@ -3687,29 +3687,26 @@
           <w:bCs w:val="0"/>
           <w:rtl w:val="0"/>
         </w:rPr>
-        <w:t xml:space="preserve">Formato: vídeo vertical, 15 a 20 segundos, SEM FALAR — gravar com um dos síndicos da </w:t>
-      </w:r>
-      <w:r>
-        <w:rPr>
-          <w:b w:val="0"/>
-          <w:bCs w:val="0"/>
-          <w:rtl w:val="0"/>
-        </w:rPr>
-        <w:t xml:space="preserve">Strategia</w:t>
-      </w:r>
-      <w:r>
-        <w:rPr>
-          <w:b w:val="0"/>
-          <w:bCs w:val="0"/>
-          <w:rtl w:val="0"/>
-        </w:rPr>
-        <w:t xml:space="preserve">, em 3 momentos</w:t>
-      </w:r>
-      <w:r>
-        <w:rPr>
-          <w:rtl w:val="0"/>
-        </w:rPr>
-        <w:t xml:space="preserve">.</w:t>
+        <w:t>Formato: vídeo vertical, 15 a 20 segundos, SEM FALAR — gravar com um dos síndicos da Strategia, em 3 momentos. Referência: https://www.instagram.com/p/DUGVTVbEXPY/</w:t>
+      </w:r>
+      <w:r>
+        <w:rPr>
+          <w:b w:val="0"/>
+          <w:bCs w:val="0"/>
+          <w:rtl w:val="0"/>
+        </w:rPr>
+      </w:r>
+      <w:r>
+        <w:rPr>
+          <w:b w:val="0"/>
+          <w:bCs w:val="0"/>
+          <w:rtl w:val="0"/>
+        </w:rPr>
+      </w:r>
+      <w:r>
+        <w:rPr>
+          <w:rtl w:val="0"/>
+        </w:rPr>
       </w:r>
     </w:p>
     <w:p>
@@ -3758,7 +3755,7 @@
           <w:bCs w:val="0"/>
           <w:rtl w:val="0"/>
         </w:rPr>
-        <w:t xml:space="preserve">Momento 3: reveal — câmera mostra o porta-retrato de frente, com uma palavra escrita à mão dentro dele no lugar de uma foto (ex.: "BOLETOS", "TAXA CONDOMINIAL" ou "MORADORES EM DIA" — escolher a mais engraçada/real pro dia a dia de vocês)</w:t>
+        <w:t>Momento 3: reveal — câmera mostra o porta-retrato de frente, com a palavra "BOLETOS" escrita à mão dentro dele, no lugar de uma foto</w:t>
       </w:r>
       <w:r>
         <w:rPr>

</xml_diff>

<commit_message>
Substitui "pra" por "para" em todo o calendário de setembro
Correção de padronização de linguagem solicitada pela cliente,
aplicada a todas as ocorrências de "pra" (e "Pra") no documento.

Co-Authored-By: Claude Sonnet 5 <noreply@anthropic.com>
Claude-Session: https://claude.ai/code/session_01Qco3rELextfq6k1B91gUBk
</commit_message>
<xml_diff>
--- a/strategia-sindicos/calendarios-editoriais/Calendario_Editorial_Strategia_Setembro2026.docx
+++ b/strategia-sindicos/calendarios-editoriais/Calendario_Editorial_Strategia_Setembro2026.docx
@@ -266,7 +266,7 @@
           <w:bCs w:val="1"/>
           <w:rtl w:val="0"/>
         </w:rPr>
-        <w:t xml:space="preserve">Depoimento da moradora, gravado no carro, falando direto pra câmera </w:t>
+        <w:t xml:space="preserve">Depoimento da moradora, gravado no carro, falando direto para câmera </w:t>
       </w:r>
     </w:p>
     <w:p>
@@ -1531,7 +1531,7 @@
           <w:bCs w:val="1"/>
           <w:rtl w:val="0"/>
         </w:rPr>
-        <w:t xml:space="preserve">Depoimento do morador (senhor), gravado em casa, falando direto pra câmera </w:t>
+        <w:t xml:space="preserve">Depoimento do morador (senhor), gravado em casa, falando direto para câmera </w:t>
       </w:r>
     </w:p>
     <w:p>
@@ -1828,7 +1828,7 @@
           <w:bCs w:val="0"/>
           <w:rtl w:val="0"/>
         </w:rPr>
-        <w:t xml:space="preserve">Formato: Vídeo vertical curto — síndico(a) responde direto pra câmera, reaproveitando o formato de caixinha de perguntas dos Stories</w:t>
+        <w:t>Formato: Vídeo vertical curto — síndico(a) responde direto para câmera, reaproveitando o formato de caixinha de perguntas dos Stories</w:t>
       </w:r>
       <w:r>
         <w:rPr>
@@ -2822,7 +2822,7 @@
           <w:bCs w:val="0"/>
           <w:rtl w:val="0"/>
         </w:rPr>
-        <w:t xml:space="preserve">Roteiro — Cena 2: pessoa olha de leve pra câmera/pra cima, expressão cansada ou de alívio</w:t>
+        <w:t>Roteiro — Cena 2: pessoa olha de leve para câmera/para cima, expressão cansada ou de alívio</w:t>
       </w:r>
       <w:r>
         <w:rPr>
@@ -2961,7 +2961,7 @@
           <w:bCs w:val="0"/>
           <w:rtl w:val="0"/>
         </w:rPr>
-        <w:t xml:space="preserve">ocê também "fica à disposição" torcendo pra ninguém precisar dela</w:t>
+        <w:t>ocê também "fica à disposição" torcendo para ninguém precisar dela</w:t>
       </w:r>
       <w:r>
         <w:rPr>
@@ -3111,7 +3111,7 @@
           <w:bCs w:val="0"/>
           <w:rtl w:val="0"/>
         </w:rPr>
-        <w:t xml:space="preserve">Formato: vídeo vertical curto, 10 a 15 segundos — câmera posicionada atrás do computador/monitor, enquadrando o síndico(a) trabalhando de frente pra tela.</w:t>
+        <w:t>Formato: vídeo vertical curto, 10 a 15 segundos — câmera posicionada atrás do computador/monitor, enquadrando o síndico(a) trabalhando de frente para tela.</w:t>
       </w:r>
       <w:r>
         <w:rPr>
@@ -3147,7 +3147,7 @@
           <w:bCs w:val="0"/>
           <w:rtl w:val="0"/>
         </w:rPr>
-        <w:t xml:space="preserve">Síndico(a) digitando, concentrado(a), sem olhar pra câmera em nenhum momento.</w:t>
+        <w:t>Síndico(a) digitando, concentrado(a), sem olhar para câmera em nenhum momento.</w:t>
       </w:r>
       <w:r>
         <w:rPr>
@@ -3165,7 +3165,7 @@
           <w:bCs w:val="1"/>
           <w:rtl w:val="0"/>
         </w:rPr>
-        <w:t>OBSERVAÇÃO: Gravar um vídeo com CADA UM dos 5 síndicos — ou seja, 5 vídeos no total, pra termos material pra trabalhar nos próximos meses. O vídeo é simples: de 10 a 15 segundos, síndico(a) trabalhando no computador, câmera no ângulo que mostre a parte de trás do computador/tampa do notebook e o síndico(a) digitando, concentrado(a) (sem olhar pra câmera). Fazer isso com cada um dos síndicos e salvar em alta resolução. Referência de enquadramento: mesmo ângulo do vídeo do "fico à disposição" (câmera atrás do notebook, mostrando a tela/tampa e a pessoa trabalhando de frente).</w:t>
+        <w:t>OBSERVAÇÃO: Gravar um vídeo com CADA UM dos 5 síndicos — ou seja, 5 vídeos no total, para termos material para trabalhar nos próximos meses. O vídeo é simples: de 10 a 15 segundos, síndico(a) trabalhando no computador, câmera no ângulo que mostre a parte de trás do computador/tampa do notebook e o síndico(a) digitando, concentrado(a) (sem olhar para câmera). Fazer isso com cada um dos síndicos e salvar em alta resolução. Referência de enquadramento: mesmo ângulo do vídeo do "fico à disposição" (câmera atrás do notebook, mostrando a tela/tampa e a pessoa trabalhando de frente).</w:t>
       </w:r>
       <w:r>
         <w:rPr>
@@ -3719,25 +3719,25 @@
           <w:bCs w:val="0"/>
           <w:rtl w:val="0"/>
         </w:rPr>
-        <w:t xml:space="preserve">Momento 1: síndico(a) sentado(a) à mesa de trabalho, notebook aberto, ar cansado, digitando/mexendo no computador; na mesa, um porta-retrato virado de costas pra câmera.</w:t>
-      </w:r>
-      <w:r>
-        <w:rPr>
-          <w:rtl w:val="0"/>
-        </w:rPr>
-      </w:r>
-    </w:p>
-    <w:p>
-      <w:pPr>
-        <w:rPr/>
-      </w:pPr>
-      <w:r>
-        <w:rPr>
-          <w:b w:val="0"/>
-          <w:bCs w:val="0"/>
-          <w:rtl w:val="0"/>
-        </w:rPr>
-        <w:t xml:space="preserve">Momento 2: síndico(a) pega o porta-retrato com as duas mãos e olha pra ele, ainda de costas pra câmera.</w:t>
+        <w:t>Momento 1: síndico(a) sentado(a) à mesa de trabalho, notebook aberto, ar cansado, digitando/mexendo no computador; na mesa, um porta-retrato virado de costas para câmera.</w:t>
+      </w:r>
+      <w:r>
+        <w:rPr>
+          <w:rtl w:val="0"/>
+        </w:rPr>
+      </w:r>
+    </w:p>
+    <w:p>
+      <w:pPr>
+        <w:rPr/>
+      </w:pPr>
+      <w:r>
+        <w:rPr>
+          <w:b w:val="0"/>
+          <w:bCs w:val="0"/>
+          <w:rtl w:val="0"/>
+        </w:rPr>
+        <w:t>Momento 2: síndico(a) pega o porta-retrato com as duas mãos e olha para ele, ainda de costas para câmera.</w:t>
       </w:r>
       <w:r>
         <w:rPr>

</xml_diff>